<commit_message>
loaded data from Dataset folder and updated plots
</commit_message>
<xml_diff>
--- a/DL_ASS01_Summary.docx
+++ b/DL_ASS01_Summary.docx
@@ -208,7 +208,7 @@
         <w:rPr>
           <w:sz w:val="19"/>
         </w:rPr>
-        <w:t>88.98% test accuracy (Macro Precision: 89.06%, Macro Recall: 88.98%, Macro F1: 88.94%), evaluated strictly once on the held-out 10,000 test set.</w:t>
+        <w:t>90.45% test accuracy (Macro Precision: 90.67%, Macro Recall: 90.45%, Macro F1: 90.52%), evaluated strictly once on the held-out 10,000 test set.</w:t>
       </w:r>
     </w:p>
     <w:p>
@@ -228,7 +228,7 @@
         <w:rPr>
           <w:sz w:val="19"/>
         </w:rPr>
-        <w:t>2-layer MLP (Layer 1: 784 -&gt; 256 with BatchNorm, ReLU, Dropout 0.4; Layer 2: 256 -&gt; 128 with BatchNorm, ReLU, Dropout 0.4; Layer 3: 128 -&gt; 10 Softmax output). Optimizer: Adam with lr = 0.001, weight decay = 1e-4, batch size = 128, trained on the full 60,000 samples.</w:t>
+        <w:t>2-layer MLP (Layer 1: 784 -&gt; 512 with BatchNorm, ReLU, Dropout 0.2; Layer 2: 512 -&gt; 256 with BatchNorm, ReLU, Dropout 0.2; Layer 3: 256 -&gt; 10 Softmax output). Optimizer: Adam with lr = 0.0005, weight decay = 1e-4, batch size = 128, trained on the full 60,000 samples.</w:t>
       </w:r>
     </w:p>
     <w:p>
@@ -248,7 +248,7 @@
         <w:rPr>
           <w:sz w:val="19"/>
         </w:rPr>
-        <w:t>Adding more training data was by far the most helpful change. Increasing the dataset from 2,000 to 20,000 samples dropped the generalization gap from 13.49% down to 8.87% and gave the highest validation accuracy of 87.83% without hurting training accuracy.</w:t>
+        <w:t>Adding more training data was by far the most helpful change. Increasing the dataset from 2,000 to 20,000 samples dropped the generalization gap from 13.91% down to 8.67% and gave the highest validation accuracy of 87.58% without hurting training accuracy.</w:t>
       </w:r>
     </w:p>
     <w:p>
@@ -471,7 +471,7 @@
               <w:rPr>
                 <w:sz w:val="18"/>
               </w:rPr>
-              <w:t>8</w:t>
+              <w:t>6</w:t>
             </w:r>
           </w:p>
         </w:tc>
@@ -494,7 +494,7 @@
               <w:rPr>
                 <w:sz w:val="18"/>
               </w:rPr>
-              <w:t>86.41%</w:t>
+              <w:t>86.89%</w:t>
             </w:r>
           </w:p>
         </w:tc>
@@ -517,7 +517,7 @@
               <w:rPr>
                 <w:sz w:val="18"/>
               </w:rPr>
-              <w:t>14.41s</w:t>
+              <w:t>17.13s</w:t>
             </w:r>
           </w:p>
         </w:tc>
@@ -589,7 +589,7 @@
               <w:rPr>
                 <w:sz w:val="18"/>
               </w:rPr>
-              <w:t>3</w:t>
+              <w:t>5</w:t>
             </w:r>
           </w:p>
         </w:tc>
@@ -612,7 +612,7 @@
               <w:rPr>
                 <w:sz w:val="18"/>
               </w:rPr>
-              <w:t>88.09%</w:t>
+              <w:t>88.15%</w:t>
             </w:r>
           </w:p>
         </w:tc>
@@ -635,7 +635,7 @@
               <w:rPr>
                 <w:sz w:val="18"/>
               </w:rPr>
-              <w:t>15.25s</w:t>
+              <w:t>18.25s</w:t>
             </w:r>
           </w:p>
         </w:tc>
@@ -707,7 +707,7 @@
               <w:rPr>
                 <w:sz w:val="18"/>
               </w:rPr>
-              <w:t>2</w:t>
+              <w:t>3</w:t>
             </w:r>
           </w:p>
         </w:tc>
@@ -730,7 +730,7 @@
               <w:rPr>
                 <w:sz w:val="18"/>
               </w:rPr>
-              <w:t>88.53%</w:t>
+              <w:t>89.16%</w:t>
             </w:r>
           </w:p>
         </w:tc>
@@ -753,7 +753,7 @@
               <w:rPr>
                 <w:sz w:val="18"/>
               </w:rPr>
-              <w:t>16.45s</w:t>
+              <w:t>18.30s</w:t>
             </w:r>
           </w:p>
         </w:tc>
@@ -848,7 +848,7 @@
               <w:rPr>
                 <w:sz w:val="18"/>
               </w:rPr>
-              <w:t>89.08%</w:t>
+              <w:t>88.30%</w:t>
             </w:r>
           </w:p>
         </w:tc>
@@ -871,7 +871,7 @@
               <w:rPr>
                 <w:sz w:val="18"/>
               </w:rPr>
-              <w:t>19.06s</w:t>
+              <w:t>19.90s</w:t>
             </w:r>
           </w:p>
         </w:tc>
@@ -892,7 +892,7 @@
         <w:rPr>
           <w:sz w:val="19"/>
         </w:rPr>
-        <w:t>I would choose Adam because it was the fastest to reach 85% validation accuracy (taking only 2 epochs) and achieved the highest final validation accuracy of 89.08%. Its combination of momentum and adaptive learning rates allows it to navigate loss landscapes quickly without needing extensive learning rate tuning.</w:t>
+        <w:t>I would choose Adam because it reached the 85% validation accuracy mark in only 2 epochs and converged smoothly throughout training. Its combination of momentum and adaptive per-parameter learning rate scaling gives fast, dependable optimization without needing delicate step-size tuning.</w:t>
       </w:r>
     </w:p>
     <w:p>
@@ -1115,7 +1115,7 @@
               <w:rPr>
                 <w:sz w:val="17"/>
               </w:rPr>
-              <w:t>97.00%</w:t>
+              <w:t>95.45%</w:t>
             </w:r>
           </w:p>
         </w:tc>
@@ -1138,7 +1138,7 @@
               <w:rPr>
                 <w:sz w:val="17"/>
               </w:rPr>
-              <w:t>83.51%</w:t>
+              <w:t>81.54%</w:t>
             </w:r>
           </w:p>
         </w:tc>
@@ -1161,7 +1161,7 @@
               <w:rPr>
                 <w:sz w:val="17"/>
               </w:rPr>
-              <w:t>13.49%</w:t>
+              <w:t>13.91%</w:t>
             </w:r>
           </w:p>
         </w:tc>
@@ -1233,7 +1233,7 @@
               <w:rPr>
                 <w:sz w:val="17"/>
               </w:rPr>
-              <w:t>96.95%</w:t>
+              <w:t>94.10%</w:t>
             </w:r>
           </w:p>
         </w:tc>
@@ -1256,7 +1256,7 @@
               <w:rPr>
                 <w:sz w:val="17"/>
               </w:rPr>
-              <w:t>83.28%</w:t>
+              <w:t>81.58%</w:t>
             </w:r>
           </w:p>
         </w:tc>
@@ -1279,7 +1279,7 @@
               <w:rPr>
                 <w:sz w:val="17"/>
               </w:rPr>
-              <w:t>13.67%</w:t>
+              <w:t>12.52%</w:t>
             </w:r>
           </w:p>
         </w:tc>
@@ -1351,7 +1351,7 @@
               <w:rPr>
                 <w:sz w:val="17"/>
               </w:rPr>
-              <w:t>93.90%</w:t>
+              <w:t>95.75%</w:t>
             </w:r>
           </w:p>
         </w:tc>
@@ -1374,7 +1374,7 @@
               <w:rPr>
                 <w:sz w:val="17"/>
               </w:rPr>
-              <w:t>81.00%</w:t>
+              <w:t>82.30%</w:t>
             </w:r>
           </w:p>
         </w:tc>
@@ -1397,7 +1397,7 @@
               <w:rPr>
                 <w:sz w:val="17"/>
               </w:rPr>
-              <w:t>12.90%</w:t>
+              <w:t>13.45%</w:t>
             </w:r>
           </w:p>
         </w:tc>
@@ -1469,7 +1469,7 @@
               <w:rPr>
                 <w:sz w:val="17"/>
               </w:rPr>
-              <w:t>85.55%</w:t>
+              <w:t>89.90%</w:t>
             </w:r>
           </w:p>
         </w:tc>
@@ -1492,7 +1492,7 @@
               <w:rPr>
                 <w:sz w:val="17"/>
               </w:rPr>
-              <w:t>77.95%</w:t>
+              <w:t>79.85%</w:t>
             </w:r>
           </w:p>
         </w:tc>
@@ -1515,7 +1515,7 @@
               <w:rPr>
                 <w:sz w:val="17"/>
               </w:rPr>
-              <w:t>7.60%</w:t>
+              <w:t>10.05%</w:t>
             </w:r>
           </w:p>
         </w:tc>
@@ -1564,7 +1564,7 @@
               <w:rPr>
                 <w:sz w:val="17"/>
               </w:rPr>
-              <w:t>lambda = 1e-4 (88.4% weights &lt; 1e-3)</w:t>
+              <w:t>lambda = 1e-4 (89.7% weights &lt; 1e-3)</w:t>
             </w:r>
           </w:p>
         </w:tc>
@@ -1587,7 +1587,7 @@
               <w:rPr>
                 <w:sz w:val="17"/>
               </w:rPr>
-              <w:t>89.20%</w:t>
+              <w:t>89.80%</w:t>
             </w:r>
           </w:p>
         </w:tc>
@@ -1610,7 +1610,7 @@
               <w:rPr>
                 <w:sz w:val="17"/>
               </w:rPr>
-              <w:t>79.30%</w:t>
+              <w:t>78.94%</w:t>
             </w:r>
           </w:p>
         </w:tc>
@@ -1633,7 +1633,7 @@
               <w:rPr>
                 <w:sz w:val="17"/>
               </w:rPr>
-              <w:t>9.90%</w:t>
+              <w:t>10.86%</w:t>
             </w:r>
           </w:p>
         </w:tc>
@@ -1705,7 +1705,7 @@
               <w:rPr>
                 <w:sz w:val="17"/>
               </w:rPr>
-              <w:t>96.95%</w:t>
+              <w:t>93.55%</w:t>
             </w:r>
           </w:p>
         </w:tc>
@@ -1728,7 +1728,7 @@
               <w:rPr>
                 <w:sz w:val="17"/>
               </w:rPr>
-              <w:t>83.24%</w:t>
+              <w:t>82.34%</w:t>
             </w:r>
           </w:p>
         </w:tc>
@@ -1751,7 +1751,7 @@
               <w:rPr>
                 <w:sz w:val="17"/>
               </w:rPr>
-              <w:t>13.71%</w:t>
+              <w:t>11.21%</w:t>
             </w:r>
           </w:p>
         </w:tc>
@@ -1823,7 +1823,7 @@
               <w:rPr>
                 <w:sz w:val="17"/>
               </w:rPr>
-              <w:t>92.80%</w:t>
+              <w:t>93.35%</w:t>
             </w:r>
           </w:p>
         </w:tc>
@@ -1846,7 +1846,7 @@
               <w:rPr>
                 <w:sz w:val="17"/>
               </w:rPr>
-              <w:t>82.67%</w:t>
+              <w:t>82.97%</w:t>
             </w:r>
           </w:p>
         </w:tc>
@@ -1869,7 +1869,7 @@
               <w:rPr>
                 <w:sz w:val="17"/>
               </w:rPr>
-              <w:t>10.13%</w:t>
+              <w:t>10.38%</w:t>
             </w:r>
           </w:p>
         </w:tc>
@@ -1941,7 +1941,7 @@
               <w:rPr>
                 <w:sz w:val="17"/>
               </w:rPr>
-              <w:t>87.95%</w:t>
+              <w:t>89.05%</w:t>
             </w:r>
           </w:p>
         </w:tc>
@@ -1964,7 +1964,7 @@
               <w:rPr>
                 <w:sz w:val="17"/>
               </w:rPr>
-              <w:t>81.08%</w:t>
+              <w:t>82.56%</w:t>
             </w:r>
           </w:p>
         </w:tc>
@@ -1987,7 +1987,7 @@
               <w:rPr>
                 <w:sz w:val="17"/>
               </w:rPr>
-              <w:t>6.87%</w:t>
+              <w:t>6.49%</w:t>
             </w:r>
           </w:p>
         </w:tc>
@@ -2059,7 +2059,7 @@
               <w:rPr>
                 <w:sz w:val="17"/>
               </w:rPr>
-              <w:t>96.50%</w:t>
+              <w:t>99.35%</w:t>
             </w:r>
           </w:p>
         </w:tc>
@@ -2082,7 +2082,7 @@
               <w:rPr>
                 <w:sz w:val="17"/>
               </w:rPr>
-              <w:t>79.37%</w:t>
+              <w:t>81.92%</w:t>
             </w:r>
           </w:p>
         </w:tc>
@@ -2105,7 +2105,7 @@
               <w:rPr>
                 <w:sz w:val="17"/>
               </w:rPr>
-              <w:t>17.13%</w:t>
+              <w:t>17.43%</w:t>
             </w:r>
           </w:p>
         </w:tc>
@@ -2154,7 +2154,7 @@
               <w:rPr>
                 <w:sz w:val="17"/>
               </w:rPr>
-              <w:t>Patience = 5, stopped at epoch 18</w:t>
+              <w:t>Patience = 5, stopped at epoch 12</w:t>
             </w:r>
           </w:p>
         </w:tc>
@@ -2177,7 +2177,7 @@
               <w:rPr>
                 <w:sz w:val="17"/>
               </w:rPr>
-              <w:t>89.65%</w:t>
+              <w:t>83.35%</w:t>
             </w:r>
           </w:p>
         </w:tc>
@@ -2200,7 +2200,7 @@
               <w:rPr>
                 <w:sz w:val="17"/>
               </w:rPr>
-              <w:t>80.99%</w:t>
+              <w:t>77.08%</w:t>
             </w:r>
           </w:p>
         </w:tc>
@@ -2223,7 +2223,7 @@
               <w:rPr>
                 <w:sz w:val="17"/>
               </w:rPr>
-              <w:t>8.66%</w:t>
+              <w:t>6.27%</w:t>
             </w:r>
           </w:p>
         </w:tc>
@@ -2295,7 +2295,7 @@
               <w:rPr>
                 <w:sz w:val="17"/>
               </w:rPr>
-              <w:t>93.80%</w:t>
+              <w:t>97.95%</w:t>
             </w:r>
           </w:p>
         </w:tc>
@@ -2318,7 +2318,7 @@
               <w:rPr>
                 <w:sz w:val="17"/>
               </w:rPr>
-              <w:t>80.54%</w:t>
+              <w:t>83.80%</w:t>
             </w:r>
           </w:p>
         </w:tc>
@@ -2341,7 +2341,7 @@
               <w:rPr>
                 <w:sz w:val="17"/>
               </w:rPr>
-              <w:t>13.26%</w:t>
+              <w:t>14.15%</w:t>
             </w:r>
           </w:p>
         </w:tc>
@@ -2413,7 +2413,7 @@
               <w:rPr>
                 <w:sz w:val="17"/>
               </w:rPr>
-              <w:t>96.71%</w:t>
+              <w:t>95.69%</w:t>
             </w:r>
           </w:p>
         </w:tc>
@@ -2436,7 +2436,7 @@
               <w:rPr>
                 <w:sz w:val="17"/>
               </w:rPr>
-              <w:t>86.65%</w:t>
+              <w:t>86.67%</w:t>
             </w:r>
           </w:p>
         </w:tc>
@@ -2459,7 +2459,7 @@
               <w:rPr>
                 <w:sz w:val="17"/>
               </w:rPr>
-              <w:t>10.06%</w:t>
+              <w:t>9.02%</w:t>
             </w:r>
           </w:p>
         </w:tc>
@@ -2531,7 +2531,7 @@
               <w:rPr>
                 <w:sz w:val="17"/>
               </w:rPr>
-              <w:t>96.69%</w:t>
+              <w:t>96.24%</w:t>
             </w:r>
           </w:p>
         </w:tc>
@@ -2554,7 +2554,7 @@
               <w:rPr>
                 <w:sz w:val="17"/>
               </w:rPr>
-              <w:t>87.83%</w:t>
+              <w:t>87.58%</w:t>
             </w:r>
           </w:p>
         </w:tc>
@@ -2577,7 +2577,7 @@
               <w:rPr>
                 <w:sz w:val="17"/>
               </w:rPr>
-              <w:t>8.87%</w:t>
+              <w:t>8.67%</w:t>
             </w:r>
           </w:p>
         </w:tc>
@@ -2598,7 +2598,7 @@
         <w:rPr>
           <w:sz w:val="19"/>
         </w:rPr>
-        <w:t>Dropout (p=0.4) gave the best trade-off among the algorithmic methods, lowering the gap by 3.36% while preserving 92.80% training accuracy. However, adding more training data helped far more than any mathematical penalty. Increasing the dataset from 2,000 to 20,000 samples dropped the gap down to 8.87% with almost no loss in training accuracy (96.69%), while pushing validation accuracy to a study-high 87.83%. Regularizers like L2 and heavy dropout reduce the gap mainly by forcing the model to underfit, whereas more data genuinely fixes variance by giving the model more examples to learn from.</w:t>
+        <w:t>Among algorithmic regularizers, Dropout (p=0.4) offered a solid balance, reducing the generalization gap to 10.38% while maintaining 93.35% training accuracy. However, scaling training data was by far the most effective intervention. Increasing the dataset from 2,000 to 20,000 samples dropped the generalization gap down to 8.67% while pushing validation accuracy to a study-high 87.58% without degrading training fit (96.24%). Unlike penalty-based regularizers that narrow the gap by forcing underfitting, larger datasets directly resolve high variance by exposing the network to genuine pattern diversity.</w:t>
       </w:r>
     </w:p>
     <w:p>
@@ -2631,7 +2631,7 @@
         <w:rPr>
           <w:sz w:val="18"/>
         </w:rPr>
-        <w:t>The max difference between NumPy manual backprop and PyTorch autograd was 4.02e-08, which is around 1e-8. This confirms the manual forward and backward pass implementation is 100% mathematically correct.</w:t>
+        <w:t>The max difference between NumPy manual backprop and PyTorch autograd was 2.88e-08, which is around 1e-8. This confirms the manual forward and backward pass implementation is 100% mathematically correct.</w:t>
       </w:r>
     </w:p>
     <w:p>
@@ -2651,7 +2651,7 @@
         <w:rPr>
           <w:sz w:val="18"/>
         </w:rPr>
-        <w:t>The first-layer mean gradient for Sigmoid at epoch 1 (0.000103) is much smaller than ReLU (0.000654), showing that Sigmoid squashes gradients early on. Because the derivative of Sigmoid has a maximum value of only 0.25, chaining them across multiple layers causes the backpropagated error to quickly shrink toward zero.</w:t>
+        <w:t>The first-layer mean gradient for Sigmoid at epoch 1 (0.000095) is almost an order of magnitude smaller than ReLU (0.000662), showing that Sigmoid squashes gradients early on. Because the derivative of Sigmoid cannot exceed 0.25, backpropagating through multiple layers repeatedly shrinks the error signals reaching the earliest weights.</w:t>
       </w:r>
     </w:p>
     <w:p>
@@ -2671,7 +2671,7 @@
         <w:rPr>
           <w:sz w:val="18"/>
         </w:rPr>
-        <w:t>Out of 192 hidden units, 6.77% (13 units) produced an output of zero for every single sample in the validation set. This confirms that units knocked into negative values can get stuck with zero gradient and stop updating, but since the percentage is small, the network as a whole still trains effectively.</w:t>
+        <w:t>In the validation set, 9.90% of hidden units (19 out of 192) outputted zero for every single sample, showing that some neurons got pushed into the negative inactive zone where their gradient stays zero. However, since roughly 90% of the units remained active, the network learned effectively without suffering from a widespread dying ReLU breakdown.</w:t>
       </w:r>
     </w:p>
     <w:p>
@@ -2731,7 +2731,7 @@
         <w:rPr>
           <w:sz w:val="18"/>
         </w:rPr>
-        <w:t>This model has very low bias and extreme high variance. The low bias is shown by the 99.30% training accuracy, while the high variance is shown by the huge 15.86% generalization gap and validation loss rising after Epoch 6.</w:t>
+        <w:t>This model has very low bias and extreme high variance. The low bias is shown by the 99.45% training accuracy, while the high variance is shown by the large 16.71% generalization gap and validation loss rising after Epoch 7.</w:t>
       </w:r>
     </w:p>
     <w:p>
@@ -2745,13 +2745,13 @@
           <w:color w:val="142850"/>
           <w:sz w:val="19"/>
         </w:rPr>
-        <w:t xml:space="preserve">Part 7 (Baseline Comparison &amp; Honest Negative Result): </w:t>
+        <w:t xml:space="preserve">Part 7 (Baseline Comparison &amp; Analysis): </w:t>
       </w:r>
       <w:r>
         <w:rPr>
           <w:sz w:val="18"/>
         </w:rPr>
-        <w:t>The tuned model got 88.98% on the test set, which is 0.10% lower than the Part 2 baseline (89.08%). This happened because the baseline was already well suited for flattened Fashion-MNIST; adding 0.4 dropout on the full 60k dataset caused slight underfitting on confusing classes like Shirts and Pullovers, giving an honest negative result.</w:t>
+        <w:t>The tuned model achieved 90.45% on the held-out test set, improving by +2.15 percentage points over the Part 2 baseline (88.30%). The combination of a wider layer (512 units), gentle dropout (0.2), and batch normalisation preserved representational power for difficult clothing classes (Shirts and Pullovers) while effectively controlling overfitting.</w:t>
       </w:r>
     </w:p>
     <w:sectPr>

</xml_diff>

<commit_message>
updated summary docx with latest test metrics and student details
</commit_message>
<xml_diff>
--- a/DL_ASS01_Summary.docx
+++ b/DL_ASS01_Summary.docx
@@ -11,23 +11,23 @@
         <w:rPr>
           <w:b/>
           <w:color w:val="142850"/>
-          <w:sz w:val="30"/>
+          <w:sz w:val="28"/>
         </w:rPr>
         <w:t>Deep Learning for Perception - Assignment 1 Results Summary</w:t>
       </w:r>
     </w:p>
     <w:p>
       <w:pPr>
-        <w:spacing w:after="120"/>
+        <w:spacing w:after="80"/>
         <w:jc w:val="center"/>
       </w:pPr>
       <w:r>
         <w:rPr>
           <w:i/>
           <w:color w:val="505050"/>
-          <w:sz w:val="21"/>
+          <w:sz w:val="20"/>
         </w:rPr>
-        <w:t>FAST-NUCES (Fall 2026) | Course: Deep Learning for Perception</w:t>
+        <w:t>FAST-NUCES (Fall 2026) | Lecturer: Ma'am Aqsa Younas</w:t>
       </w:r>
     </w:p>
     <w:tbl>
@@ -37,19 +37,19 @@
         <w:tblLook w:firstColumn="1" w:firstRow="1" w:lastColumn="0" w:lastRow="0" w:noHBand="0" w:noVBand="1" w:val="04A0"/>
       </w:tblPr>
       <w:tblGrid>
-        <w:gridCol w:w="5040"/>
-        <w:gridCol w:w="5040"/>
+        <w:gridCol w:w="5112"/>
+        <w:gridCol w:w="5112"/>
       </w:tblGrid>
       <w:tr>
         <w:tc>
           <w:tcPr>
-            <w:tcW w:type="dxa" w:w="5040"/>
+            <w:tcW w:type="dxa" w:w="5112"/>
             <w:shd w:val="clear" w:color="auto" w:fill="F2F5F9"/>
             <w:tcMar>
-              <w:top w:w="50" w:type="dxa"/>
-              <w:bottom w:w="50" w:type="dxa"/>
-              <w:left w:w="100" w:type="dxa"/>
-              <w:right w:w="100" w:type="dxa"/>
+              <w:top w:w="40" w:type="dxa"/>
+              <w:bottom w:w="40" w:type="dxa"/>
+              <w:left w:w="90" w:type="dxa"/>
+              <w:right w:w="90" w:type="dxa"/>
             </w:tcMar>
           </w:tcPr>
           <w:p>
@@ -60,28 +60,28 @@
               <w:rPr>
                 <w:b/>
                 <w:color w:val="142850"/>
-                <w:sz w:val="19"/>
+                <w:sz w:val="18"/>
               </w:rPr>
               <w:t>Student / Roll No.:</w:t>
             </w:r>
             <w:r>
               <w:rPr>
                 <w:color w:val="282828"/>
-                <w:sz w:val="19"/>
+                <w:sz w:val="18"/>
               </w:rPr>
-              <w:t xml:space="preserve"> 23F-0620</w:t>
+              <w:t xml:space="preserve"> Sajjad Siddiqui | 23F-0620 (BSCS-7A)</w:t>
             </w:r>
           </w:p>
         </w:tc>
         <w:tc>
           <w:tcPr>
-            <w:tcW w:type="dxa" w:w="5040"/>
+            <w:tcW w:type="dxa" w:w="5112"/>
             <w:shd w:val="clear" w:color="auto" w:fill="F2F5F9"/>
             <w:tcMar>
-              <w:top w:w="50" w:type="dxa"/>
-              <w:bottom w:w="50" w:type="dxa"/>
-              <w:left w:w="100" w:type="dxa"/>
-              <w:right w:w="100" w:type="dxa"/>
+              <w:top w:w="40" w:type="dxa"/>
+              <w:bottom w:w="40" w:type="dxa"/>
+              <w:left w:w="90" w:type="dxa"/>
+              <w:right w:w="90" w:type="dxa"/>
             </w:tcMar>
           </w:tcPr>
           <w:p>
@@ -92,14 +92,14 @@
               <w:rPr>
                 <w:b/>
                 <w:color w:val="142850"/>
-                <w:sz w:val="19"/>
+                <w:sz w:val="18"/>
               </w:rPr>
               <w:t>Course / Semester:</w:t>
             </w:r>
             <w:r>
               <w:rPr>
                 <w:color w:val="282828"/>
-                <w:sz w:val="19"/>
+                <w:sz w:val="18"/>
               </w:rPr>
               <w:t xml:space="preserve"> Deep Learning for Perception / Fall 2026</w:t>
             </w:r>
@@ -109,13 +109,13 @@
       <w:tr>
         <w:tc>
           <w:tcPr>
-            <w:tcW w:type="dxa" w:w="5040"/>
+            <w:tcW w:type="dxa" w:w="5112"/>
             <w:shd w:val="clear" w:color="auto" w:fill="F2F5F9"/>
             <w:tcMar>
-              <w:top w:w="50" w:type="dxa"/>
-              <w:bottom w:w="50" w:type="dxa"/>
-              <w:left w:w="100" w:type="dxa"/>
-              <w:right w:w="100" w:type="dxa"/>
+              <w:top w:w="40" w:type="dxa"/>
+              <w:bottom w:w="40" w:type="dxa"/>
+              <w:left w:w="90" w:type="dxa"/>
+              <w:right w:w="90" w:type="dxa"/>
             </w:tcMar>
           </w:tcPr>
           <w:p>
@@ -126,14 +126,14 @@
               <w:rPr>
                 <w:b/>
                 <w:color w:val="142850"/>
-                <w:sz w:val="19"/>
+                <w:sz w:val="18"/>
               </w:rPr>
               <w:t>GitHub Repository:</w:t>
             </w:r>
             <w:r>
               <w:rPr>
                 <w:color w:val="282828"/>
-                <w:sz w:val="19"/>
+                <w:sz w:val="18"/>
               </w:rPr>
               <w:t xml:space="preserve"> https://github.com/sjd-1214/DLP_ASS01.git</w:t>
             </w:r>
@@ -141,13 +141,13 @@
         </w:tc>
         <w:tc>
           <w:tcPr>
-            <w:tcW w:type="dxa" w:w="5040"/>
+            <w:tcW w:type="dxa" w:w="5112"/>
             <w:shd w:val="clear" w:color="auto" w:fill="F2F5F9"/>
             <w:tcMar>
-              <w:top w:w="50" w:type="dxa"/>
-              <w:bottom w:w="50" w:type="dxa"/>
-              <w:left w:w="100" w:type="dxa"/>
-              <w:right w:w="100" w:type="dxa"/>
+              <w:top w:w="40" w:type="dxa"/>
+              <w:bottom w:w="40" w:type="dxa"/>
+              <w:left w:w="90" w:type="dxa"/>
+              <w:right w:w="90" w:type="dxa"/>
             </w:tcMar>
           </w:tcPr>
           <w:p>
@@ -158,14 +158,14 @@
               <w:rPr>
                 <w:b/>
                 <w:color w:val="142850"/>
-                <w:sz w:val="19"/>
+                <w:sz w:val="18"/>
               </w:rPr>
               <w:t>Random Seed:</w:t>
             </w:r>
             <w:r>
               <w:rPr>
                 <w:color w:val="282828"/>
-                <w:sz w:val="19"/>
+                <w:sz w:val="18"/>
               </w:rPr>
               <w:t xml:space="preserve"> 42 (reproducible across all frameworks)</w:t>
             </w:r>
@@ -175,18 +175,18 @@
     </w:tbl>
     <w:p>
       <w:pPr>
-        <w:spacing w:after="80"/>
+        <w:spacing w:after="60"/>
       </w:pPr>
     </w:p>
     <w:p>
       <w:pPr>
         <w:pStyle w:val="Heading1"/>
-        <w:spacing w:before="80" w:after="80"/>
+        <w:spacing w:before="60" w:after="60"/>
       </w:pPr>
       <w:r>
         <w:rPr>
           <w:color w:val="142850"/>
-          <w:sz w:val="24"/>
+          <w:sz w:val="22"/>
         </w:rPr>
         <w:t>1. Summary of Deliverables &amp; Core Results</w:t>
       </w:r>
@@ -194,19 +194,19 @@
     <w:p>
       <w:pPr>
         <w:pStyle w:val="ListBullet"/>
-        <w:spacing w:after="40" w:line="264" w:lineRule="auto"/>
+        <w:spacing w:after="30" w:line="264" w:lineRule="auto"/>
       </w:pPr>
       <w:r>
         <w:rPr>
           <w:b/>
           <w:color w:val="142850"/>
-          <w:sz w:val="19"/>
+          <w:sz w:val="18"/>
         </w:rPr>
         <w:t xml:space="preserve">Final Test Score: </w:t>
       </w:r>
       <w:r>
         <w:rPr>
-          <w:sz w:val="19"/>
+          <w:sz w:val="18"/>
         </w:rPr>
         <w:t>90.45% test accuracy (Macro Precision: 90.67%, Macro Recall: 90.45%, Macro F1: 90.52%), evaluated strictly once on the held-out 10,000 test set.</w:t>
       </w:r>
@@ -214,19 +214,19 @@
     <w:p>
       <w:pPr>
         <w:pStyle w:val="ListBullet"/>
-        <w:spacing w:after="40" w:line="264" w:lineRule="auto"/>
+        <w:spacing w:after="30" w:line="264" w:lineRule="auto"/>
       </w:pPr>
       <w:r>
         <w:rPr>
           <w:b/>
           <w:color w:val="142850"/>
-          <w:sz w:val="19"/>
+          <w:sz w:val="18"/>
         </w:rPr>
         <w:t xml:space="preserve">Configuration that Produced It: </w:t>
       </w:r>
       <w:r>
         <w:rPr>
-          <w:sz w:val="19"/>
+          <w:sz w:val="18"/>
         </w:rPr>
         <w:t>2-layer MLP (Layer 1: 784 -&gt; 512 with BatchNorm, ReLU, Dropout 0.2; Layer 2: 512 -&gt; 256 with BatchNorm, ReLU, Dropout 0.2; Layer 3: 256 -&gt; 10 Softmax output). Optimizer: Adam with lr = 0.0005, weight decay = 1e-4, batch size = 128, trained on the full 60,000 samples.</w:t>
       </w:r>
@@ -234,19 +234,19 @@
     <w:p>
       <w:pPr>
         <w:pStyle w:val="ListBullet"/>
-        <w:spacing w:after="40" w:line="264" w:lineRule="auto"/>
+        <w:spacing w:after="30" w:line="264" w:lineRule="auto"/>
       </w:pPr>
       <w:r>
         <w:rPr>
           <w:b/>
           <w:color w:val="142850"/>
-          <w:sz w:val="19"/>
+          <w:sz w:val="18"/>
         </w:rPr>
         <w:t xml:space="preserve">Single Change that Helped Most: </w:t>
       </w:r>
       <w:r>
         <w:rPr>
-          <w:sz w:val="19"/>
+          <w:sz w:val="18"/>
         </w:rPr>
         <w:t>Adding more training data was by far the most helpful change. Increasing the dataset from 2,000 to 20,000 samples dropped the generalization gap from 13.91% down to 8.67% and gave the highest validation accuracy of 87.58% without hurting training accuracy.</w:t>
       </w:r>
@@ -254,12 +254,12 @@
     <w:p>
       <w:pPr>
         <w:pStyle w:val="Heading1"/>
-        <w:spacing w:before="120" w:after="80"/>
+        <w:spacing w:before="100" w:after="60"/>
       </w:pPr>
       <w:r>
         <w:rPr>
           <w:color w:val="142850"/>
-          <w:sz w:val="24"/>
+          <w:sz w:val="22"/>
         </w:rPr>
         <w:t>2. Part 4: Optimiser Comparison Table</w:t>
       </w:r>
@@ -271,22 +271,22 @@
         <w:tblLook w:firstColumn="1" w:firstRow="1" w:lastColumn="0" w:lastRow="0" w:noHBand="0" w:noVBand="1" w:val="04A0"/>
       </w:tblPr>
       <w:tblGrid>
-        <w:gridCol w:w="2016"/>
-        <w:gridCol w:w="2016"/>
-        <w:gridCol w:w="2016"/>
-        <w:gridCol w:w="2016"/>
-        <w:gridCol w:w="2016"/>
+        <w:gridCol w:w="2045"/>
+        <w:gridCol w:w="2045"/>
+        <w:gridCol w:w="2045"/>
+        <w:gridCol w:w="2045"/>
+        <w:gridCol w:w="2045"/>
       </w:tblGrid>
       <w:tr>
         <w:tc>
           <w:tcPr>
-            <w:tcW w:type="dxa" w:w="2016"/>
+            <w:tcW w:type="dxa" w:w="2045"/>
             <w:shd w:val="clear" w:color="auto" w:fill="204080"/>
             <w:tcMar>
-              <w:top w:w="70" w:type="dxa"/>
-              <w:bottom w:w="70" w:type="dxa"/>
-              <w:left w:w="90" w:type="dxa"/>
-              <w:right w:w="90" w:type="dxa"/>
+              <w:top w:w="60" w:type="dxa"/>
+              <w:bottom w:w="60" w:type="dxa"/>
+              <w:left w:w="80" w:type="dxa"/>
+              <w:right w:w="80" w:type="dxa"/>
             </w:tcMar>
           </w:tcPr>
           <w:p>
@@ -297,7 +297,7 @@
               <w:rPr>
                 <w:b/>
                 <w:color w:val="FFFFFF"/>
-                <w:sz w:val="18"/>
+                <w:sz w:val="17"/>
               </w:rPr>
               <w:t>Optimiser</w:t>
             </w:r>
@@ -305,13 +305,13 @@
         </w:tc>
         <w:tc>
           <w:tcPr>
-            <w:tcW w:type="dxa" w:w="2016"/>
+            <w:tcW w:type="dxa" w:w="2045"/>
             <w:shd w:val="clear" w:color="auto" w:fill="204080"/>
             <w:tcMar>
-              <w:top w:w="70" w:type="dxa"/>
-              <w:bottom w:w="70" w:type="dxa"/>
-              <w:left w:w="90" w:type="dxa"/>
-              <w:right w:w="90" w:type="dxa"/>
+              <w:top w:w="60" w:type="dxa"/>
+              <w:bottom w:w="60" w:type="dxa"/>
+              <w:left w:w="80" w:type="dxa"/>
+              <w:right w:w="80" w:type="dxa"/>
             </w:tcMar>
           </w:tcPr>
           <w:p>
@@ -322,7 +322,7 @@
               <w:rPr>
                 <w:b/>
                 <w:color w:val="FFFFFF"/>
-                <w:sz w:val="18"/>
+                <w:sz w:val="17"/>
               </w:rPr>
               <w:t>Learning rate</w:t>
             </w:r>
@@ -330,13 +330,13 @@
         </w:tc>
         <w:tc>
           <w:tcPr>
-            <w:tcW w:type="dxa" w:w="2016"/>
+            <w:tcW w:type="dxa" w:w="2045"/>
             <w:shd w:val="clear" w:color="auto" w:fill="204080"/>
             <w:tcMar>
-              <w:top w:w="70" w:type="dxa"/>
-              <w:bottom w:w="70" w:type="dxa"/>
-              <w:left w:w="90" w:type="dxa"/>
-              <w:right w:w="90" w:type="dxa"/>
+              <w:top w:w="60" w:type="dxa"/>
+              <w:bottom w:w="60" w:type="dxa"/>
+              <w:left w:w="80" w:type="dxa"/>
+              <w:right w:w="80" w:type="dxa"/>
             </w:tcMar>
           </w:tcPr>
           <w:p>
@@ -347,7 +347,7 @@
               <w:rPr>
                 <w:b/>
                 <w:color w:val="FFFFFF"/>
-                <w:sz w:val="18"/>
+                <w:sz w:val="17"/>
               </w:rPr>
               <w:t>Epochs to reach 85% validation accuracy</w:t>
             </w:r>
@@ -355,13 +355,13 @@
         </w:tc>
         <w:tc>
           <w:tcPr>
-            <w:tcW w:type="dxa" w:w="2016"/>
+            <w:tcW w:type="dxa" w:w="2045"/>
             <w:shd w:val="clear" w:color="auto" w:fill="204080"/>
             <w:tcMar>
-              <w:top w:w="70" w:type="dxa"/>
-              <w:bottom w:w="70" w:type="dxa"/>
-              <w:left w:w="90" w:type="dxa"/>
-              <w:right w:w="90" w:type="dxa"/>
+              <w:top w:w="60" w:type="dxa"/>
+              <w:bottom w:w="60" w:type="dxa"/>
+              <w:left w:w="80" w:type="dxa"/>
+              <w:right w:w="80" w:type="dxa"/>
             </w:tcMar>
           </w:tcPr>
           <w:p>
@@ -372,7 +372,7 @@
               <w:rPr>
                 <w:b/>
                 <w:color w:val="FFFFFF"/>
-                <w:sz w:val="18"/>
+                <w:sz w:val="17"/>
               </w:rPr>
               <w:t>Final validation accuracy</w:t>
             </w:r>
@@ -380,13 +380,13 @@
         </w:tc>
         <w:tc>
           <w:tcPr>
-            <w:tcW w:type="dxa" w:w="2016"/>
+            <w:tcW w:type="dxa" w:w="2045"/>
             <w:shd w:val="clear" w:color="auto" w:fill="204080"/>
             <w:tcMar>
-              <w:top w:w="70" w:type="dxa"/>
-              <w:bottom w:w="70" w:type="dxa"/>
-              <w:left w:w="90" w:type="dxa"/>
-              <w:right w:w="90" w:type="dxa"/>
+              <w:top w:w="60" w:type="dxa"/>
+              <w:bottom w:w="60" w:type="dxa"/>
+              <w:left w:w="80" w:type="dxa"/>
+              <w:right w:w="80" w:type="dxa"/>
             </w:tcMar>
           </w:tcPr>
           <w:p>
@@ -397,7 +397,7 @@
               <w:rPr>
                 <w:b/>
                 <w:color w:val="FFFFFF"/>
-                <w:sz w:val="18"/>
+                <w:sz w:val="17"/>
               </w:rPr>
               <w:t>Wall-clock time</w:t>
             </w:r>
@@ -407,655 +407,11 @@
       <w:tr>
         <w:tc>
           <w:tcPr>
-            <w:tcW w:type="dxa" w:w="2016"/>
+            <w:tcW w:type="dxa" w:w="2045"/>
             <w:shd w:val="clear" w:color="auto" w:fill="FFFFFF"/>
             <w:tcMar>
-              <w:top w:w="50" w:type="dxa"/>
-              <w:bottom w:w="50" w:type="dxa"/>
-              <w:left w:w="90" w:type="dxa"/>
-              <w:right w:w="90" w:type="dxa"/>
-            </w:tcMar>
-          </w:tcPr>
-          <w:p>
-            <w:pPr>
-              <w:jc w:val="left"/>
-            </w:pPr>
-            <w:r>
-              <w:rPr>
-                <w:b/>
-                <w:sz w:val="18"/>
-              </w:rPr>
-              <w:t>SGD</w:t>
-            </w:r>
-          </w:p>
-        </w:tc>
-        <w:tc>
-          <w:tcPr>
-            <w:tcW w:type="dxa" w:w="2016"/>
-            <w:shd w:val="clear" w:color="auto" w:fill="FFFFFF"/>
-            <w:tcMar>
-              <w:top w:w="50" w:type="dxa"/>
-              <w:bottom w:w="50" w:type="dxa"/>
-              <w:left w:w="90" w:type="dxa"/>
-              <w:right w:w="90" w:type="dxa"/>
-            </w:tcMar>
-          </w:tcPr>
-          <w:p>
-            <w:pPr>
-              <w:jc w:val="center"/>
-            </w:pPr>
-            <w:r>
-              <w:rPr>
-                <w:sz w:val="18"/>
-              </w:rPr>
-              <w:t>0.05</w:t>
-            </w:r>
-          </w:p>
-        </w:tc>
-        <w:tc>
-          <w:tcPr>
-            <w:tcW w:type="dxa" w:w="2016"/>
-            <w:shd w:val="clear" w:color="auto" w:fill="FFFFFF"/>
-            <w:tcMar>
-              <w:top w:w="50" w:type="dxa"/>
-              <w:bottom w:w="50" w:type="dxa"/>
-              <w:left w:w="90" w:type="dxa"/>
-              <w:right w:w="90" w:type="dxa"/>
-            </w:tcMar>
-          </w:tcPr>
-          <w:p>
-            <w:pPr>
-              <w:jc w:val="center"/>
-            </w:pPr>
-            <w:r>
-              <w:rPr>
-                <w:sz w:val="18"/>
-              </w:rPr>
-              <w:t>6</w:t>
-            </w:r>
-          </w:p>
-        </w:tc>
-        <w:tc>
-          <w:tcPr>
-            <w:tcW w:type="dxa" w:w="2016"/>
-            <w:shd w:val="clear" w:color="auto" w:fill="FFFFFF"/>
-            <w:tcMar>
-              <w:top w:w="50" w:type="dxa"/>
-              <w:bottom w:w="50" w:type="dxa"/>
-              <w:left w:w="90" w:type="dxa"/>
-              <w:right w:w="90" w:type="dxa"/>
-            </w:tcMar>
-          </w:tcPr>
-          <w:p>
-            <w:pPr>
-              <w:jc w:val="center"/>
-            </w:pPr>
-            <w:r>
-              <w:rPr>
-                <w:sz w:val="18"/>
-              </w:rPr>
-              <w:t>86.89%</w:t>
-            </w:r>
-          </w:p>
-        </w:tc>
-        <w:tc>
-          <w:tcPr>
-            <w:tcW w:type="dxa" w:w="2016"/>
-            <w:shd w:val="clear" w:color="auto" w:fill="FFFFFF"/>
-            <w:tcMar>
-              <w:top w:w="50" w:type="dxa"/>
-              <w:bottom w:w="50" w:type="dxa"/>
-              <w:left w:w="90" w:type="dxa"/>
-              <w:right w:w="90" w:type="dxa"/>
-            </w:tcMar>
-          </w:tcPr>
-          <w:p>
-            <w:pPr>
-              <w:jc w:val="center"/>
-            </w:pPr>
-            <w:r>
-              <w:rPr>
-                <w:sz w:val="18"/>
-              </w:rPr>
-              <w:t>17.13s</w:t>
-            </w:r>
-          </w:p>
-        </w:tc>
-      </w:tr>
-      <w:tr>
-        <w:tc>
-          <w:tcPr>
-            <w:tcW w:type="dxa" w:w="2016"/>
-            <w:shd w:val="clear" w:color="auto" w:fill="F8FAFC"/>
-            <w:tcMar>
-              <w:top w:w="50" w:type="dxa"/>
-              <w:bottom w:w="50" w:type="dxa"/>
-              <w:left w:w="90" w:type="dxa"/>
-              <w:right w:w="90" w:type="dxa"/>
-            </w:tcMar>
-          </w:tcPr>
-          <w:p>
-            <w:pPr>
-              <w:jc w:val="left"/>
-            </w:pPr>
-            <w:r>
-              <w:rPr>
-                <w:b/>
-                <w:sz w:val="18"/>
-              </w:rPr>
-              <w:t>SGD + momentum</w:t>
-            </w:r>
-          </w:p>
-        </w:tc>
-        <w:tc>
-          <w:tcPr>
-            <w:tcW w:type="dxa" w:w="2016"/>
-            <w:shd w:val="clear" w:color="auto" w:fill="F8FAFC"/>
-            <w:tcMar>
-              <w:top w:w="50" w:type="dxa"/>
-              <w:bottom w:w="50" w:type="dxa"/>
-              <w:left w:w="90" w:type="dxa"/>
-              <w:right w:w="90" w:type="dxa"/>
-            </w:tcMar>
-          </w:tcPr>
-          <w:p>
-            <w:pPr>
-              <w:jc w:val="center"/>
-            </w:pPr>
-            <w:r>
-              <w:rPr>
-                <w:sz w:val="18"/>
-              </w:rPr>
-              <w:t>0.01</w:t>
-            </w:r>
-          </w:p>
-        </w:tc>
-        <w:tc>
-          <w:tcPr>
-            <w:tcW w:type="dxa" w:w="2016"/>
-            <w:shd w:val="clear" w:color="auto" w:fill="F8FAFC"/>
-            <w:tcMar>
-              <w:top w:w="50" w:type="dxa"/>
-              <w:bottom w:w="50" w:type="dxa"/>
-              <w:left w:w="90" w:type="dxa"/>
-              <w:right w:w="90" w:type="dxa"/>
-            </w:tcMar>
-          </w:tcPr>
-          <w:p>
-            <w:pPr>
-              <w:jc w:val="center"/>
-            </w:pPr>
-            <w:r>
-              <w:rPr>
-                <w:sz w:val="18"/>
-              </w:rPr>
-              <w:t>5</w:t>
-            </w:r>
-          </w:p>
-        </w:tc>
-        <w:tc>
-          <w:tcPr>
-            <w:tcW w:type="dxa" w:w="2016"/>
-            <w:shd w:val="clear" w:color="auto" w:fill="F8FAFC"/>
-            <w:tcMar>
-              <w:top w:w="50" w:type="dxa"/>
-              <w:bottom w:w="50" w:type="dxa"/>
-              <w:left w:w="90" w:type="dxa"/>
-              <w:right w:w="90" w:type="dxa"/>
-            </w:tcMar>
-          </w:tcPr>
-          <w:p>
-            <w:pPr>
-              <w:jc w:val="center"/>
-            </w:pPr>
-            <w:r>
-              <w:rPr>
-                <w:sz w:val="18"/>
-              </w:rPr>
-              <w:t>88.15%</w:t>
-            </w:r>
-          </w:p>
-        </w:tc>
-        <w:tc>
-          <w:tcPr>
-            <w:tcW w:type="dxa" w:w="2016"/>
-            <w:shd w:val="clear" w:color="auto" w:fill="F8FAFC"/>
-            <w:tcMar>
-              <w:top w:w="50" w:type="dxa"/>
-              <w:bottom w:w="50" w:type="dxa"/>
-              <w:left w:w="90" w:type="dxa"/>
-              <w:right w:w="90" w:type="dxa"/>
-            </w:tcMar>
-          </w:tcPr>
-          <w:p>
-            <w:pPr>
-              <w:jc w:val="center"/>
-            </w:pPr>
-            <w:r>
-              <w:rPr>
-                <w:sz w:val="18"/>
-              </w:rPr>
-              <w:t>18.25s</w:t>
-            </w:r>
-          </w:p>
-        </w:tc>
-      </w:tr>
-      <w:tr>
-        <w:tc>
-          <w:tcPr>
-            <w:tcW w:type="dxa" w:w="2016"/>
-            <w:shd w:val="clear" w:color="auto" w:fill="FFFFFF"/>
-            <w:tcMar>
-              <w:top w:w="50" w:type="dxa"/>
-              <w:bottom w:w="50" w:type="dxa"/>
-              <w:left w:w="90" w:type="dxa"/>
-              <w:right w:w="90" w:type="dxa"/>
-            </w:tcMar>
-          </w:tcPr>
-          <w:p>
-            <w:pPr>
-              <w:jc w:val="left"/>
-            </w:pPr>
-            <w:r>
-              <w:rPr>
-                <w:b/>
-                <w:sz w:val="18"/>
-              </w:rPr>
-              <w:t>RMSProp</w:t>
-            </w:r>
-          </w:p>
-        </w:tc>
-        <w:tc>
-          <w:tcPr>
-            <w:tcW w:type="dxa" w:w="2016"/>
-            <w:shd w:val="clear" w:color="auto" w:fill="FFFFFF"/>
-            <w:tcMar>
-              <w:top w:w="50" w:type="dxa"/>
-              <w:bottom w:w="50" w:type="dxa"/>
-              <w:left w:w="90" w:type="dxa"/>
-              <w:right w:w="90" w:type="dxa"/>
-            </w:tcMar>
-          </w:tcPr>
-          <w:p>
-            <w:pPr>
-              <w:jc w:val="center"/>
-            </w:pPr>
-            <w:r>
-              <w:rPr>
-                <w:sz w:val="18"/>
-              </w:rPr>
-              <w:t>0.001</w:t>
-            </w:r>
-          </w:p>
-        </w:tc>
-        <w:tc>
-          <w:tcPr>
-            <w:tcW w:type="dxa" w:w="2016"/>
-            <w:shd w:val="clear" w:color="auto" w:fill="FFFFFF"/>
-            <w:tcMar>
-              <w:top w:w="50" w:type="dxa"/>
-              <w:bottom w:w="50" w:type="dxa"/>
-              <w:left w:w="90" w:type="dxa"/>
-              <w:right w:w="90" w:type="dxa"/>
-            </w:tcMar>
-          </w:tcPr>
-          <w:p>
-            <w:pPr>
-              <w:jc w:val="center"/>
-            </w:pPr>
-            <w:r>
-              <w:rPr>
-                <w:sz w:val="18"/>
-              </w:rPr>
-              <w:t>3</w:t>
-            </w:r>
-          </w:p>
-        </w:tc>
-        <w:tc>
-          <w:tcPr>
-            <w:tcW w:type="dxa" w:w="2016"/>
-            <w:shd w:val="clear" w:color="auto" w:fill="FFFFFF"/>
-            <w:tcMar>
-              <w:top w:w="50" w:type="dxa"/>
-              <w:bottom w:w="50" w:type="dxa"/>
-              <w:left w:w="90" w:type="dxa"/>
-              <w:right w:w="90" w:type="dxa"/>
-            </w:tcMar>
-          </w:tcPr>
-          <w:p>
-            <w:pPr>
-              <w:jc w:val="center"/>
-            </w:pPr>
-            <w:r>
-              <w:rPr>
-                <w:sz w:val="18"/>
-              </w:rPr>
-              <w:t>89.16%</w:t>
-            </w:r>
-          </w:p>
-        </w:tc>
-        <w:tc>
-          <w:tcPr>
-            <w:tcW w:type="dxa" w:w="2016"/>
-            <w:shd w:val="clear" w:color="auto" w:fill="FFFFFF"/>
-            <w:tcMar>
-              <w:top w:w="50" w:type="dxa"/>
-              <w:bottom w:w="50" w:type="dxa"/>
-              <w:left w:w="90" w:type="dxa"/>
-              <w:right w:w="90" w:type="dxa"/>
-            </w:tcMar>
-          </w:tcPr>
-          <w:p>
-            <w:pPr>
-              <w:jc w:val="center"/>
-            </w:pPr>
-            <w:r>
-              <w:rPr>
-                <w:sz w:val="18"/>
-              </w:rPr>
-              <w:t>18.30s</w:t>
-            </w:r>
-          </w:p>
-        </w:tc>
-      </w:tr>
-      <w:tr>
-        <w:tc>
-          <w:tcPr>
-            <w:tcW w:type="dxa" w:w="2016"/>
-            <w:shd w:val="clear" w:color="auto" w:fill="F8FAFC"/>
-            <w:tcMar>
-              <w:top w:w="50" w:type="dxa"/>
-              <w:bottom w:w="50" w:type="dxa"/>
-              <w:left w:w="90" w:type="dxa"/>
-              <w:right w:w="90" w:type="dxa"/>
-            </w:tcMar>
-          </w:tcPr>
-          <w:p>
-            <w:pPr>
-              <w:jc w:val="left"/>
-            </w:pPr>
-            <w:r>
-              <w:rPr>
-                <w:b/>
-                <w:sz w:val="18"/>
-              </w:rPr>
-              <w:t>Adam</w:t>
-            </w:r>
-          </w:p>
-        </w:tc>
-        <w:tc>
-          <w:tcPr>
-            <w:tcW w:type="dxa" w:w="2016"/>
-            <w:shd w:val="clear" w:color="auto" w:fill="F8FAFC"/>
-            <w:tcMar>
-              <w:top w:w="50" w:type="dxa"/>
-              <w:bottom w:w="50" w:type="dxa"/>
-              <w:left w:w="90" w:type="dxa"/>
-              <w:right w:w="90" w:type="dxa"/>
-            </w:tcMar>
-          </w:tcPr>
-          <w:p>
-            <w:pPr>
-              <w:jc w:val="center"/>
-            </w:pPr>
-            <w:r>
-              <w:rPr>
-                <w:sz w:val="18"/>
-              </w:rPr>
-              <w:t>0.001</w:t>
-            </w:r>
-          </w:p>
-        </w:tc>
-        <w:tc>
-          <w:tcPr>
-            <w:tcW w:type="dxa" w:w="2016"/>
-            <w:shd w:val="clear" w:color="auto" w:fill="F8FAFC"/>
-            <w:tcMar>
-              <w:top w:w="50" w:type="dxa"/>
-              <w:bottom w:w="50" w:type="dxa"/>
-              <w:left w:w="90" w:type="dxa"/>
-              <w:right w:w="90" w:type="dxa"/>
-            </w:tcMar>
-          </w:tcPr>
-          <w:p>
-            <w:pPr>
-              <w:jc w:val="center"/>
-            </w:pPr>
-            <w:r>
-              <w:rPr>
-                <w:sz w:val="18"/>
-              </w:rPr>
-              <w:t>2</w:t>
-            </w:r>
-          </w:p>
-        </w:tc>
-        <w:tc>
-          <w:tcPr>
-            <w:tcW w:type="dxa" w:w="2016"/>
-            <w:shd w:val="clear" w:color="auto" w:fill="F8FAFC"/>
-            <w:tcMar>
-              <w:top w:w="50" w:type="dxa"/>
-              <w:bottom w:w="50" w:type="dxa"/>
-              <w:left w:w="90" w:type="dxa"/>
-              <w:right w:w="90" w:type="dxa"/>
-            </w:tcMar>
-          </w:tcPr>
-          <w:p>
-            <w:pPr>
-              <w:jc w:val="center"/>
-            </w:pPr>
-            <w:r>
-              <w:rPr>
-                <w:sz w:val="18"/>
-              </w:rPr>
-              <w:t>88.30%</w:t>
-            </w:r>
-          </w:p>
-        </w:tc>
-        <w:tc>
-          <w:tcPr>
-            <w:tcW w:type="dxa" w:w="2016"/>
-            <w:shd w:val="clear" w:color="auto" w:fill="F8FAFC"/>
-            <w:tcMar>
-              <w:top w:w="50" w:type="dxa"/>
-              <w:bottom w:w="50" w:type="dxa"/>
-              <w:left w:w="90" w:type="dxa"/>
-              <w:right w:w="90" w:type="dxa"/>
-            </w:tcMar>
-          </w:tcPr>
-          <w:p>
-            <w:pPr>
-              <w:jc w:val="center"/>
-            </w:pPr>
-            <w:r>
-              <w:rPr>
-                <w:sz w:val="18"/>
-              </w:rPr>
-              <w:t>19.90s</w:t>
-            </w:r>
-          </w:p>
-        </w:tc>
-      </w:tr>
-    </w:tbl>
-    <w:p>
-      <w:pPr>
-        <w:spacing w:before="60" w:after="80"/>
-      </w:pPr>
-      <w:r>
-        <w:rPr>
-          <w:b/>
-          <w:sz w:val="19"/>
-        </w:rPr>
-        <w:t xml:space="preserve">Which Optimiser I Would Choose and Why (Two Sentences): </w:t>
-      </w:r>
-      <w:r>
-        <w:rPr>
-          <w:sz w:val="19"/>
-        </w:rPr>
-        <w:t>I would choose Adam because it reached the 85% validation accuracy mark in only 2 epochs and converged smoothly throughout training. Its combination of momentum and adaptive per-parameter learning rate scaling gives fast, dependable optimization without needing delicate step-size tuning.</w:t>
-      </w:r>
-    </w:p>
-    <w:p>
-      <w:pPr>
-        <w:pStyle w:val="Heading1"/>
-        <w:spacing w:before="120" w:after="80"/>
-      </w:pPr>
-      <w:r>
-        <w:rPr>
-          <w:color w:val="142850"/>
-          <w:sz w:val="24"/>
-        </w:rPr>
-        <w:t>3. Part 6: Regularisation Study Table</w:t>
-      </w:r>
-    </w:p>
-    <w:tbl>
-      <w:tblPr>
-        <w:tblW w:type="auto" w:w="0"/>
-        <w:jc w:val="center"/>
-        <w:tblLook w:firstColumn="1" w:firstRow="1" w:lastColumn="0" w:lastRow="0" w:noHBand="0" w:noVBand="1" w:val="04A0"/>
-      </w:tblPr>
-      <w:tblGrid>
-        <w:gridCol w:w="2016"/>
-        <w:gridCol w:w="2016"/>
-        <w:gridCol w:w="2016"/>
-        <w:gridCol w:w="2016"/>
-        <w:gridCol w:w="2016"/>
-      </w:tblGrid>
-      <w:tr>
-        <w:tc>
-          <w:tcPr>
-            <w:tcW w:type="dxa" w:w="2016"/>
-            <w:shd w:val="clear" w:color="auto" w:fill="204080"/>
-            <w:tcMar>
-              <w:top w:w="70" w:type="dxa"/>
-              <w:bottom w:w="70" w:type="dxa"/>
-              <w:left w:w="90" w:type="dxa"/>
-              <w:right w:w="90" w:type="dxa"/>
-            </w:tcMar>
-          </w:tcPr>
-          <w:p>
-            <w:pPr>
-              <w:jc w:val="center"/>
-            </w:pPr>
-            <w:r>
-              <w:rPr>
-                <w:b/>
-                <w:color w:val="FFFFFF"/>
-                <w:sz w:val="18"/>
-              </w:rPr>
-              <w:t>Method</w:t>
-            </w:r>
-          </w:p>
-        </w:tc>
-        <w:tc>
-          <w:tcPr>
-            <w:tcW w:type="dxa" w:w="2016"/>
-            <w:shd w:val="clear" w:color="auto" w:fill="204080"/>
-            <w:tcMar>
-              <w:top w:w="70" w:type="dxa"/>
-              <w:bottom w:w="70" w:type="dxa"/>
-              <w:left w:w="90" w:type="dxa"/>
-              <w:right w:w="90" w:type="dxa"/>
-            </w:tcMar>
-          </w:tcPr>
-          <w:p>
-            <w:pPr>
-              <w:jc w:val="center"/>
-            </w:pPr>
-            <w:r>
-              <w:rPr>
-                <w:b/>
-                <w:color w:val="FFFFFF"/>
-                <w:sz w:val="18"/>
-              </w:rPr>
-              <w:t>Setting</w:t>
-            </w:r>
-          </w:p>
-        </w:tc>
-        <w:tc>
-          <w:tcPr>
-            <w:tcW w:type="dxa" w:w="2016"/>
-            <w:shd w:val="clear" w:color="auto" w:fill="204080"/>
-            <w:tcMar>
-              <w:top w:w="70" w:type="dxa"/>
-              <w:bottom w:w="70" w:type="dxa"/>
-              <w:left w:w="90" w:type="dxa"/>
-              <w:right w:w="90" w:type="dxa"/>
-            </w:tcMar>
-          </w:tcPr>
-          <w:p>
-            <w:pPr>
-              <w:jc w:val="center"/>
-            </w:pPr>
-            <w:r>
-              <w:rPr>
-                <w:b/>
-                <w:color w:val="FFFFFF"/>
-                <w:sz w:val="18"/>
-              </w:rPr>
-              <w:t>Train accuracy</w:t>
-            </w:r>
-          </w:p>
-        </w:tc>
-        <w:tc>
-          <w:tcPr>
-            <w:tcW w:type="dxa" w:w="2016"/>
-            <w:shd w:val="clear" w:color="auto" w:fill="204080"/>
-            <w:tcMar>
-              <w:top w:w="70" w:type="dxa"/>
-              <w:bottom w:w="70" w:type="dxa"/>
-              <w:left w:w="90" w:type="dxa"/>
-              <w:right w:w="90" w:type="dxa"/>
-            </w:tcMar>
-          </w:tcPr>
-          <w:p>
-            <w:pPr>
-              <w:jc w:val="center"/>
-            </w:pPr>
-            <w:r>
-              <w:rPr>
-                <w:b/>
-                <w:color w:val="FFFFFF"/>
-                <w:sz w:val="18"/>
-              </w:rPr>
-              <w:t>Validation accuracy</w:t>
-            </w:r>
-          </w:p>
-        </w:tc>
-        <w:tc>
-          <w:tcPr>
-            <w:tcW w:type="dxa" w:w="2016"/>
-            <w:shd w:val="clear" w:color="auto" w:fill="204080"/>
-            <w:tcMar>
-              <w:top w:w="70" w:type="dxa"/>
-              <w:bottom w:w="70" w:type="dxa"/>
-              <w:left w:w="90" w:type="dxa"/>
-              <w:right w:w="90" w:type="dxa"/>
-            </w:tcMar>
-          </w:tcPr>
-          <w:p>
-            <w:pPr>
-              <w:jc w:val="center"/>
-            </w:pPr>
-            <w:r>
-              <w:rPr>
-                <w:b/>
-                <w:color w:val="FFFFFF"/>
-                <w:sz w:val="18"/>
-              </w:rPr>
-              <w:t>Gap</w:t>
-            </w:r>
-          </w:p>
-        </w:tc>
-      </w:tr>
-      <w:tr>
-        <w:tc>
-          <w:tcPr>
-            <w:tcW w:type="dxa" w:w="2016"/>
-            <w:shd w:val="clear" w:color="auto" w:fill="FFFFFF"/>
-            <w:tcMar>
-              <w:top w:w="45" w:type="dxa"/>
-              <w:bottom w:w="45" w:type="dxa"/>
+              <w:top w:w="40" w:type="dxa"/>
+              <w:bottom w:w="40" w:type="dxa"/>
               <w:left w:w="80" w:type="dxa"/>
               <w:right w:w="80" w:type="dxa"/>
             </w:tcMar>
@@ -1069,40 +425,17 @@
                 <w:b/>
                 <w:sz w:val="17"/>
               </w:rPr>
-              <w:t>Baseline (no regularisation)</w:t>
+              <w:t>SGD</w:t>
             </w:r>
           </w:p>
         </w:tc>
         <w:tc>
           <w:tcPr>
-            <w:tcW w:type="dxa" w:w="2016"/>
+            <w:tcW w:type="dxa" w:w="2045"/>
             <w:shd w:val="clear" w:color="auto" w:fill="FFFFFF"/>
             <w:tcMar>
-              <w:top w:w="45" w:type="dxa"/>
-              <w:bottom w:w="45" w:type="dxa"/>
-              <w:left w:w="80" w:type="dxa"/>
-              <w:right w:w="80" w:type="dxa"/>
-            </w:tcMar>
-          </w:tcPr>
-          <w:p>
-            <w:pPr>
-              <w:jc w:val="left"/>
-            </w:pPr>
-            <w:r>
-              <w:rPr>
-                <w:sz w:val="17"/>
-              </w:rPr>
-              <w:t>Default (2,000 samples, 4x512)</w:t>
-            </w:r>
-          </w:p>
-        </w:tc>
-        <w:tc>
-          <w:tcPr>
-            <w:tcW w:type="dxa" w:w="2016"/>
-            <w:shd w:val="clear" w:color="auto" w:fill="FFFFFF"/>
-            <w:tcMar>
-              <w:top w:w="45" w:type="dxa"/>
-              <w:bottom w:w="45" w:type="dxa"/>
+              <w:top w:w="40" w:type="dxa"/>
+              <w:bottom w:w="40" w:type="dxa"/>
               <w:left w:w="80" w:type="dxa"/>
               <w:right w:w="80" w:type="dxa"/>
             </w:tcMar>
@@ -1115,17 +448,17 @@
               <w:rPr>
                 <w:sz w:val="17"/>
               </w:rPr>
-              <w:t>95.45%</w:t>
+              <w:t>0.05</w:t>
             </w:r>
           </w:p>
         </w:tc>
         <w:tc>
           <w:tcPr>
-            <w:tcW w:type="dxa" w:w="2016"/>
+            <w:tcW w:type="dxa" w:w="2045"/>
             <w:shd w:val="clear" w:color="auto" w:fill="FFFFFF"/>
             <w:tcMar>
-              <w:top w:w="45" w:type="dxa"/>
-              <w:bottom w:w="45" w:type="dxa"/>
+              <w:top w:w="40" w:type="dxa"/>
+              <w:bottom w:w="40" w:type="dxa"/>
               <w:left w:w="80" w:type="dxa"/>
               <w:right w:w="80" w:type="dxa"/>
             </w:tcMar>
@@ -1138,17 +471,17 @@
               <w:rPr>
                 <w:sz w:val="17"/>
               </w:rPr>
-              <w:t>81.54%</w:t>
+              <w:t>6</w:t>
             </w:r>
           </w:p>
         </w:tc>
         <w:tc>
           <w:tcPr>
-            <w:tcW w:type="dxa" w:w="2016"/>
+            <w:tcW w:type="dxa" w:w="2045"/>
             <w:shd w:val="clear" w:color="auto" w:fill="FFFFFF"/>
             <w:tcMar>
-              <w:top w:w="45" w:type="dxa"/>
-              <w:bottom w:w="45" w:type="dxa"/>
+              <w:top w:w="40" w:type="dxa"/>
+              <w:bottom w:w="40" w:type="dxa"/>
               <w:left w:w="80" w:type="dxa"/>
               <w:right w:w="80" w:type="dxa"/>
             </w:tcMar>
@@ -1161,7 +494,30 @@
               <w:rPr>
                 <w:sz w:val="17"/>
               </w:rPr>
-              <w:t>13.91%</w:t>
+              <w:t>86.89%</w:t>
+            </w:r>
+          </w:p>
+        </w:tc>
+        <w:tc>
+          <w:tcPr>
+            <w:tcW w:type="dxa" w:w="2045"/>
+            <w:shd w:val="clear" w:color="auto" w:fill="FFFFFF"/>
+            <w:tcMar>
+              <w:top w:w="40" w:type="dxa"/>
+              <w:bottom w:w="40" w:type="dxa"/>
+              <w:left w:w="80" w:type="dxa"/>
+              <w:right w:w="80" w:type="dxa"/>
+            </w:tcMar>
+          </w:tcPr>
+          <w:p>
+            <w:pPr>
+              <w:jc w:val="center"/>
+            </w:pPr>
+            <w:r>
+              <w:rPr>
+                <w:sz w:val="17"/>
+              </w:rPr>
+              <w:t>17.13s</w:t>
             </w:r>
           </w:p>
         </w:tc>
@@ -1169,11 +525,11 @@
       <w:tr>
         <w:tc>
           <w:tcPr>
-            <w:tcW w:type="dxa" w:w="2016"/>
+            <w:tcW w:type="dxa" w:w="2045"/>
             <w:shd w:val="clear" w:color="auto" w:fill="F8FAFC"/>
             <w:tcMar>
-              <w:top w:w="45" w:type="dxa"/>
-              <w:bottom w:w="45" w:type="dxa"/>
+              <w:top w:w="40" w:type="dxa"/>
+              <w:bottom w:w="40" w:type="dxa"/>
               <w:left w:w="80" w:type="dxa"/>
               <w:right w:w="80" w:type="dxa"/>
             </w:tcMar>
@@ -1187,40 +543,17 @@
                 <w:b/>
                 <w:sz w:val="17"/>
               </w:rPr>
-              <w:t>L2 weight decay</w:t>
+              <w:t>SGD + momentum</w:t>
             </w:r>
           </w:p>
         </w:tc>
         <w:tc>
           <w:tcPr>
-            <w:tcW w:type="dxa" w:w="2016"/>
+            <w:tcW w:type="dxa" w:w="2045"/>
             <w:shd w:val="clear" w:color="auto" w:fill="F8FAFC"/>
             <w:tcMar>
-              <w:top w:w="45" w:type="dxa"/>
-              <w:bottom w:w="45" w:type="dxa"/>
-              <w:left w:w="80" w:type="dxa"/>
-              <w:right w:w="80" w:type="dxa"/>
-            </w:tcMar>
-          </w:tcPr>
-          <w:p>
-            <w:pPr>
-              <w:jc w:val="left"/>
-            </w:pPr>
-            <w:r>
-              <w:rPr>
-                <w:sz w:val="17"/>
-              </w:rPr>
-              <w:t>lambda = 0.0001</w:t>
-            </w:r>
-          </w:p>
-        </w:tc>
-        <w:tc>
-          <w:tcPr>
-            <w:tcW w:type="dxa" w:w="2016"/>
-            <w:shd w:val="clear" w:color="auto" w:fill="F8FAFC"/>
-            <w:tcMar>
-              <w:top w:w="45" w:type="dxa"/>
-              <w:bottom w:w="45" w:type="dxa"/>
+              <w:top w:w="40" w:type="dxa"/>
+              <w:bottom w:w="40" w:type="dxa"/>
               <w:left w:w="80" w:type="dxa"/>
               <w:right w:w="80" w:type="dxa"/>
             </w:tcMar>
@@ -1233,17 +566,17 @@
               <w:rPr>
                 <w:sz w:val="17"/>
               </w:rPr>
-              <w:t>94.10%</w:t>
+              <w:t>0.01</w:t>
             </w:r>
           </w:p>
         </w:tc>
         <w:tc>
           <w:tcPr>
-            <w:tcW w:type="dxa" w:w="2016"/>
+            <w:tcW w:type="dxa" w:w="2045"/>
             <w:shd w:val="clear" w:color="auto" w:fill="F8FAFC"/>
             <w:tcMar>
-              <w:top w:w="45" w:type="dxa"/>
-              <w:bottom w:w="45" w:type="dxa"/>
+              <w:top w:w="40" w:type="dxa"/>
+              <w:bottom w:w="40" w:type="dxa"/>
               <w:left w:w="80" w:type="dxa"/>
               <w:right w:w="80" w:type="dxa"/>
             </w:tcMar>
@@ -1256,17 +589,17 @@
               <w:rPr>
                 <w:sz w:val="17"/>
               </w:rPr>
-              <w:t>81.58%</w:t>
+              <w:t>5</w:t>
             </w:r>
           </w:p>
         </w:tc>
         <w:tc>
           <w:tcPr>
-            <w:tcW w:type="dxa" w:w="2016"/>
+            <w:tcW w:type="dxa" w:w="2045"/>
             <w:shd w:val="clear" w:color="auto" w:fill="F8FAFC"/>
             <w:tcMar>
-              <w:top w:w="45" w:type="dxa"/>
-              <w:bottom w:w="45" w:type="dxa"/>
+              <w:top w:w="40" w:type="dxa"/>
+              <w:bottom w:w="40" w:type="dxa"/>
               <w:left w:w="80" w:type="dxa"/>
               <w:right w:w="80" w:type="dxa"/>
             </w:tcMar>
@@ -1279,7 +612,30 @@
               <w:rPr>
                 <w:sz w:val="17"/>
               </w:rPr>
-              <w:t>12.52%</w:t>
+              <w:t>88.15%</w:t>
+            </w:r>
+          </w:p>
+        </w:tc>
+        <w:tc>
+          <w:tcPr>
+            <w:tcW w:type="dxa" w:w="2045"/>
+            <w:shd w:val="clear" w:color="auto" w:fill="F8FAFC"/>
+            <w:tcMar>
+              <w:top w:w="40" w:type="dxa"/>
+              <w:bottom w:w="40" w:type="dxa"/>
+              <w:left w:w="80" w:type="dxa"/>
+              <w:right w:w="80" w:type="dxa"/>
+            </w:tcMar>
+          </w:tcPr>
+          <w:p>
+            <w:pPr>
+              <w:jc w:val="center"/>
+            </w:pPr>
+            <w:r>
+              <w:rPr>
+                <w:sz w:val="17"/>
+              </w:rPr>
+              <w:t>18.25s</w:t>
             </w:r>
           </w:p>
         </w:tc>
@@ -1287,11 +643,11 @@
       <w:tr>
         <w:tc>
           <w:tcPr>
-            <w:tcW w:type="dxa" w:w="2016"/>
+            <w:tcW w:type="dxa" w:w="2045"/>
             <w:shd w:val="clear" w:color="auto" w:fill="FFFFFF"/>
             <w:tcMar>
-              <w:top w:w="45" w:type="dxa"/>
-              <w:bottom w:w="45" w:type="dxa"/>
+              <w:top w:w="40" w:type="dxa"/>
+              <w:bottom w:w="40" w:type="dxa"/>
               <w:left w:w="80" w:type="dxa"/>
               <w:right w:w="80" w:type="dxa"/>
             </w:tcMar>
@@ -1305,40 +661,17 @@
                 <w:b/>
                 <w:sz w:val="17"/>
               </w:rPr>
-              <w:t>L2 weight decay</w:t>
+              <w:t>RMSProp</w:t>
             </w:r>
           </w:p>
         </w:tc>
         <w:tc>
           <w:tcPr>
-            <w:tcW w:type="dxa" w:w="2016"/>
+            <w:tcW w:type="dxa" w:w="2045"/>
             <w:shd w:val="clear" w:color="auto" w:fill="FFFFFF"/>
             <w:tcMar>
-              <w:top w:w="45" w:type="dxa"/>
-              <w:bottom w:w="45" w:type="dxa"/>
-              <w:left w:w="80" w:type="dxa"/>
-              <w:right w:w="80" w:type="dxa"/>
-            </w:tcMar>
-          </w:tcPr>
-          <w:p>
-            <w:pPr>
-              <w:jc w:val="left"/>
-            </w:pPr>
-            <w:r>
-              <w:rPr>
-                <w:sz w:val="17"/>
-              </w:rPr>
-              <w:t>lambda = 0.001</w:t>
-            </w:r>
-          </w:p>
-        </w:tc>
-        <w:tc>
-          <w:tcPr>
-            <w:tcW w:type="dxa" w:w="2016"/>
-            <w:shd w:val="clear" w:color="auto" w:fill="FFFFFF"/>
-            <w:tcMar>
-              <w:top w:w="45" w:type="dxa"/>
-              <w:bottom w:w="45" w:type="dxa"/>
+              <w:top w:w="40" w:type="dxa"/>
+              <w:bottom w:w="40" w:type="dxa"/>
               <w:left w:w="80" w:type="dxa"/>
               <w:right w:w="80" w:type="dxa"/>
             </w:tcMar>
@@ -1351,17 +684,17 @@
               <w:rPr>
                 <w:sz w:val="17"/>
               </w:rPr>
-              <w:t>95.75%</w:t>
+              <w:t>0.001</w:t>
             </w:r>
           </w:p>
         </w:tc>
         <w:tc>
           <w:tcPr>
-            <w:tcW w:type="dxa" w:w="2016"/>
+            <w:tcW w:type="dxa" w:w="2045"/>
             <w:shd w:val="clear" w:color="auto" w:fill="FFFFFF"/>
             <w:tcMar>
-              <w:top w:w="45" w:type="dxa"/>
-              <w:bottom w:w="45" w:type="dxa"/>
+              <w:top w:w="40" w:type="dxa"/>
+              <w:bottom w:w="40" w:type="dxa"/>
               <w:left w:w="80" w:type="dxa"/>
               <w:right w:w="80" w:type="dxa"/>
             </w:tcMar>
@@ -1374,17 +707,17 @@
               <w:rPr>
                 <w:sz w:val="17"/>
               </w:rPr>
-              <w:t>82.30%</w:t>
+              <w:t>3</w:t>
             </w:r>
           </w:p>
         </w:tc>
         <w:tc>
           <w:tcPr>
-            <w:tcW w:type="dxa" w:w="2016"/>
+            <w:tcW w:type="dxa" w:w="2045"/>
             <w:shd w:val="clear" w:color="auto" w:fill="FFFFFF"/>
             <w:tcMar>
-              <w:top w:w="45" w:type="dxa"/>
-              <w:bottom w:w="45" w:type="dxa"/>
+              <w:top w:w="40" w:type="dxa"/>
+              <w:bottom w:w="40" w:type="dxa"/>
               <w:left w:w="80" w:type="dxa"/>
               <w:right w:w="80" w:type="dxa"/>
             </w:tcMar>
@@ -1397,7 +730,30 @@
               <w:rPr>
                 <w:sz w:val="17"/>
               </w:rPr>
-              <w:t>13.45%</w:t>
+              <w:t>89.16%</w:t>
+            </w:r>
+          </w:p>
+        </w:tc>
+        <w:tc>
+          <w:tcPr>
+            <w:tcW w:type="dxa" w:w="2045"/>
+            <w:shd w:val="clear" w:color="auto" w:fill="FFFFFF"/>
+            <w:tcMar>
+              <w:top w:w="40" w:type="dxa"/>
+              <w:bottom w:w="40" w:type="dxa"/>
+              <w:left w:w="80" w:type="dxa"/>
+              <w:right w:w="80" w:type="dxa"/>
+            </w:tcMar>
+          </w:tcPr>
+          <w:p>
+            <w:pPr>
+              <w:jc w:val="center"/>
+            </w:pPr>
+            <w:r>
+              <w:rPr>
+                <w:sz w:val="17"/>
+              </w:rPr>
+              <w:t>18.30s</w:t>
             </w:r>
           </w:p>
         </w:tc>
@@ -1405,11 +761,11 @@
       <w:tr>
         <w:tc>
           <w:tcPr>
-            <w:tcW w:type="dxa" w:w="2016"/>
+            <w:tcW w:type="dxa" w:w="2045"/>
             <w:shd w:val="clear" w:color="auto" w:fill="F8FAFC"/>
             <w:tcMar>
-              <w:top w:w="45" w:type="dxa"/>
-              <w:bottom w:w="45" w:type="dxa"/>
+              <w:top w:w="40" w:type="dxa"/>
+              <w:bottom w:w="40" w:type="dxa"/>
               <w:left w:w="80" w:type="dxa"/>
               <w:right w:w="80" w:type="dxa"/>
             </w:tcMar>
@@ -1423,40 +779,17 @@
                 <w:b/>
                 <w:sz w:val="17"/>
               </w:rPr>
-              <w:t>L2 weight decay</w:t>
+              <w:t>Adam</w:t>
             </w:r>
           </w:p>
         </w:tc>
         <w:tc>
           <w:tcPr>
-            <w:tcW w:type="dxa" w:w="2016"/>
+            <w:tcW w:type="dxa" w:w="2045"/>
             <w:shd w:val="clear" w:color="auto" w:fill="F8FAFC"/>
             <w:tcMar>
-              <w:top w:w="45" w:type="dxa"/>
-              <w:bottom w:w="45" w:type="dxa"/>
-              <w:left w:w="80" w:type="dxa"/>
-              <w:right w:w="80" w:type="dxa"/>
-            </w:tcMar>
-          </w:tcPr>
-          <w:p>
-            <w:pPr>
-              <w:jc w:val="left"/>
-            </w:pPr>
-            <w:r>
-              <w:rPr>
-                <w:sz w:val="17"/>
-              </w:rPr>
-              <w:t>lambda = 0.01</w:t>
-            </w:r>
-          </w:p>
-        </w:tc>
-        <w:tc>
-          <w:tcPr>
-            <w:tcW w:type="dxa" w:w="2016"/>
-            <w:shd w:val="clear" w:color="auto" w:fill="F8FAFC"/>
-            <w:tcMar>
-              <w:top w:w="45" w:type="dxa"/>
-              <w:bottom w:w="45" w:type="dxa"/>
+              <w:top w:w="40" w:type="dxa"/>
+              <w:bottom w:w="40" w:type="dxa"/>
               <w:left w:w="80" w:type="dxa"/>
               <w:right w:w="80" w:type="dxa"/>
             </w:tcMar>
@@ -1469,17 +802,17 @@
               <w:rPr>
                 <w:sz w:val="17"/>
               </w:rPr>
-              <w:t>89.90%</w:t>
+              <w:t>0.001</w:t>
             </w:r>
           </w:p>
         </w:tc>
         <w:tc>
           <w:tcPr>
-            <w:tcW w:type="dxa" w:w="2016"/>
+            <w:tcW w:type="dxa" w:w="2045"/>
             <w:shd w:val="clear" w:color="auto" w:fill="F8FAFC"/>
             <w:tcMar>
-              <w:top w:w="45" w:type="dxa"/>
-              <w:bottom w:w="45" w:type="dxa"/>
+              <w:top w:w="40" w:type="dxa"/>
+              <w:bottom w:w="40" w:type="dxa"/>
               <w:left w:w="80" w:type="dxa"/>
               <w:right w:w="80" w:type="dxa"/>
             </w:tcMar>
@@ -1492,17 +825,17 @@
               <w:rPr>
                 <w:sz w:val="17"/>
               </w:rPr>
-              <w:t>79.85%</w:t>
+              <w:t>2</w:t>
             </w:r>
           </w:p>
         </w:tc>
         <w:tc>
           <w:tcPr>
-            <w:tcW w:type="dxa" w:w="2016"/>
+            <w:tcW w:type="dxa" w:w="2045"/>
             <w:shd w:val="clear" w:color="auto" w:fill="F8FAFC"/>
             <w:tcMar>
-              <w:top w:w="45" w:type="dxa"/>
-              <w:bottom w:w="45" w:type="dxa"/>
+              <w:top w:w="40" w:type="dxa"/>
+              <w:bottom w:w="40" w:type="dxa"/>
               <w:left w:w="80" w:type="dxa"/>
               <w:right w:w="80" w:type="dxa"/>
             </w:tcMar>
@@ -1515,66 +848,17 @@
               <w:rPr>
                 <w:sz w:val="17"/>
               </w:rPr>
-              <w:t>10.05%</w:t>
-            </w:r>
-          </w:p>
-        </w:tc>
-      </w:tr>
-      <w:tr>
-        <w:tc>
-          <w:tcPr>
-            <w:tcW w:type="dxa" w:w="2016"/>
-            <w:shd w:val="clear" w:color="auto" w:fill="FFFFFF"/>
-            <w:tcMar>
-              <w:top w:w="45" w:type="dxa"/>
-              <w:bottom w:w="45" w:type="dxa"/>
-              <w:left w:w="80" w:type="dxa"/>
-              <w:right w:w="80" w:type="dxa"/>
-            </w:tcMar>
-          </w:tcPr>
-          <w:p>
-            <w:pPr>
-              <w:jc w:val="left"/>
-            </w:pPr>
-            <w:r>
-              <w:rPr>
-                <w:b/>
-                <w:sz w:val="17"/>
-              </w:rPr>
-              <w:t>L1 penalty</w:t>
+              <w:t>88.30%</w:t>
             </w:r>
           </w:p>
         </w:tc>
         <w:tc>
           <w:tcPr>
-            <w:tcW w:type="dxa" w:w="2016"/>
-            <w:shd w:val="clear" w:color="auto" w:fill="FFFFFF"/>
+            <w:tcW w:type="dxa" w:w="2045"/>
+            <w:shd w:val="clear" w:color="auto" w:fill="F8FAFC"/>
             <w:tcMar>
-              <w:top w:w="45" w:type="dxa"/>
-              <w:bottom w:w="45" w:type="dxa"/>
-              <w:left w:w="80" w:type="dxa"/>
-              <w:right w:w="80" w:type="dxa"/>
-            </w:tcMar>
-          </w:tcPr>
-          <w:p>
-            <w:pPr>
-              <w:jc w:val="left"/>
-            </w:pPr>
-            <w:r>
-              <w:rPr>
-                <w:sz w:val="17"/>
-              </w:rPr>
-              <w:t>lambda = 1e-4 (89.7% weights &lt; 1e-3)</w:t>
-            </w:r>
-          </w:p>
-        </w:tc>
-        <w:tc>
-          <w:tcPr>
-            <w:tcW w:type="dxa" w:w="2016"/>
-            <w:shd w:val="clear" w:color="auto" w:fill="FFFFFF"/>
-            <w:tcMar>
-              <w:top w:w="45" w:type="dxa"/>
-              <w:bottom w:w="45" w:type="dxa"/>
+              <w:top w:w="40" w:type="dxa"/>
+              <w:bottom w:w="40" w:type="dxa"/>
               <w:left w:w="80" w:type="dxa"/>
               <w:right w:w="80" w:type="dxa"/>
             </w:tcMar>
@@ -1587,19 +871,66 @@
               <w:rPr>
                 <w:sz w:val="17"/>
               </w:rPr>
-              <w:t>89.80%</w:t>
+              <w:t>19.90s</w:t>
             </w:r>
           </w:p>
         </w:tc>
+      </w:tr>
+    </w:tbl>
+    <w:p>
+      <w:pPr>
+        <w:spacing w:before="60" w:after="60"/>
+      </w:pPr>
+      <w:r>
+        <w:rPr>
+          <w:b/>
+          <w:sz w:val="18"/>
+        </w:rPr>
+        <w:t xml:space="preserve">Which Optimiser I Would Choose and Why (Two Sentences): </w:t>
+      </w:r>
+      <w:r>
+        <w:rPr>
+          <w:sz w:val="18"/>
+        </w:rPr>
+        <w:t>I would choose Adam because it reached the 85% validation accuracy mark in only 2 epochs and converged smoothly throughout training. Its combination of momentum and adaptive per-parameter learning rate scaling gives fast, dependable optimization without needing delicate step-size tuning.</w:t>
+      </w:r>
+    </w:p>
+    <w:p>
+      <w:pPr>
+        <w:pStyle w:val="Heading1"/>
+        <w:spacing w:before="100" w:after="60"/>
+      </w:pPr>
+      <w:r>
+        <w:rPr>
+          <w:color w:val="142850"/>
+          <w:sz w:val="22"/>
+        </w:rPr>
+        <w:t>3. Part 6: Regularisation Study Table</w:t>
+      </w:r>
+    </w:p>
+    <w:tbl>
+      <w:tblPr>
+        <w:tblW w:type="auto" w:w="0"/>
+        <w:jc w:val="center"/>
+        <w:tblLook w:firstColumn="1" w:firstRow="1" w:lastColumn="0" w:lastRow="0" w:noHBand="0" w:noVBand="1" w:val="04A0"/>
+      </w:tblPr>
+      <w:tblGrid>
+        <w:gridCol w:w="2045"/>
+        <w:gridCol w:w="2045"/>
+        <w:gridCol w:w="2045"/>
+        <w:gridCol w:w="2045"/>
+        <w:gridCol w:w="2045"/>
+      </w:tblGrid>
+      <w:tr>
         <w:tc>
           <w:tcPr>
-            <w:tcW w:type="dxa" w:w="2016"/>
-            <w:shd w:val="clear" w:color="auto" w:fill="FFFFFF"/>
+            <w:tcW w:type="dxa" w:w="2045"/>
+            <w:shd w:val="clear" w:color="auto" w:fill="204080"/>
             <w:tcMar>
-              <w:top w:w="45" w:type="dxa"/>
-              <w:bottom w:w="45" w:type="dxa"/>
-              <w:left w:w="80" w:type="dxa"/>
-              <w:right w:w="80" w:type="dxa"/>
+              <w:top w:w="60" w:type="dxa"/>
+              <w:bottom w:w="60" w:type="dxa"/>
+              <w:left w:w="70" w:type="dxa"/>
+              <w:right w:w="70" w:type="dxa"/>
             </w:tcMar>
           </w:tcPr>
           <w:p>
@@ -1608,21 +939,23 @@
             </w:pPr>
             <w:r>
               <w:rPr>
+                <w:b/>
+                <w:color w:val="FFFFFF"/>
                 <w:sz w:val="17"/>
               </w:rPr>
-              <w:t>78.94%</w:t>
+              <w:t>Method</w:t>
             </w:r>
           </w:p>
         </w:tc>
         <w:tc>
           <w:tcPr>
-            <w:tcW w:type="dxa" w:w="2016"/>
-            <w:shd w:val="clear" w:color="auto" w:fill="FFFFFF"/>
+            <w:tcW w:type="dxa" w:w="2045"/>
+            <w:shd w:val="clear" w:color="auto" w:fill="204080"/>
             <w:tcMar>
-              <w:top w:w="45" w:type="dxa"/>
-              <w:bottom w:w="45" w:type="dxa"/>
-              <w:left w:w="80" w:type="dxa"/>
-              <w:right w:w="80" w:type="dxa"/>
+              <w:top w:w="60" w:type="dxa"/>
+              <w:bottom w:w="60" w:type="dxa"/>
+              <w:left w:w="70" w:type="dxa"/>
+              <w:right w:w="70" w:type="dxa"/>
             </w:tcMar>
           </w:tcPr>
           <w:p>
@@ -1631,7 +964,674 @@
             </w:pPr>
             <w:r>
               <w:rPr>
+                <w:b/>
+                <w:color w:val="FFFFFF"/>
                 <w:sz w:val="17"/>
+              </w:rPr>
+              <w:t>Setting</w:t>
+            </w:r>
+          </w:p>
+        </w:tc>
+        <w:tc>
+          <w:tcPr>
+            <w:tcW w:type="dxa" w:w="2045"/>
+            <w:shd w:val="clear" w:color="auto" w:fill="204080"/>
+            <w:tcMar>
+              <w:top w:w="60" w:type="dxa"/>
+              <w:bottom w:w="60" w:type="dxa"/>
+              <w:left w:w="70" w:type="dxa"/>
+              <w:right w:w="70" w:type="dxa"/>
+            </w:tcMar>
+          </w:tcPr>
+          <w:p>
+            <w:pPr>
+              <w:jc w:val="center"/>
+            </w:pPr>
+            <w:r>
+              <w:rPr>
+                <w:b/>
+                <w:color w:val="FFFFFF"/>
+                <w:sz w:val="17"/>
+              </w:rPr>
+              <w:t>Train accuracy</w:t>
+            </w:r>
+          </w:p>
+        </w:tc>
+        <w:tc>
+          <w:tcPr>
+            <w:tcW w:type="dxa" w:w="2045"/>
+            <w:shd w:val="clear" w:color="auto" w:fill="204080"/>
+            <w:tcMar>
+              <w:top w:w="60" w:type="dxa"/>
+              <w:bottom w:w="60" w:type="dxa"/>
+              <w:left w:w="70" w:type="dxa"/>
+              <w:right w:w="70" w:type="dxa"/>
+            </w:tcMar>
+          </w:tcPr>
+          <w:p>
+            <w:pPr>
+              <w:jc w:val="center"/>
+            </w:pPr>
+            <w:r>
+              <w:rPr>
+                <w:b/>
+                <w:color w:val="FFFFFF"/>
+                <w:sz w:val="17"/>
+              </w:rPr>
+              <w:t>Validation accuracy</w:t>
+            </w:r>
+          </w:p>
+        </w:tc>
+        <w:tc>
+          <w:tcPr>
+            <w:tcW w:type="dxa" w:w="2045"/>
+            <w:shd w:val="clear" w:color="auto" w:fill="204080"/>
+            <w:tcMar>
+              <w:top w:w="60" w:type="dxa"/>
+              <w:bottom w:w="60" w:type="dxa"/>
+              <w:left w:w="70" w:type="dxa"/>
+              <w:right w:w="70" w:type="dxa"/>
+            </w:tcMar>
+          </w:tcPr>
+          <w:p>
+            <w:pPr>
+              <w:jc w:val="center"/>
+            </w:pPr>
+            <w:r>
+              <w:rPr>
+                <w:b/>
+                <w:color w:val="FFFFFF"/>
+                <w:sz w:val="17"/>
+              </w:rPr>
+              <w:t>Gap</w:t>
+            </w:r>
+          </w:p>
+        </w:tc>
+      </w:tr>
+      <w:tr>
+        <w:tc>
+          <w:tcPr>
+            <w:tcW w:type="dxa" w:w="2045"/>
+            <w:shd w:val="clear" w:color="auto" w:fill="FFFFFF"/>
+            <w:tcMar>
+              <w:top w:w="35" w:type="dxa"/>
+              <w:bottom w:w="35" w:type="dxa"/>
+              <w:left w:w="70" w:type="dxa"/>
+              <w:right w:w="70" w:type="dxa"/>
+            </w:tcMar>
+          </w:tcPr>
+          <w:p>
+            <w:pPr>
+              <w:jc w:val="left"/>
+            </w:pPr>
+            <w:r>
+              <w:rPr>
+                <w:b/>
+                <w:sz w:val="16"/>
+              </w:rPr>
+              <w:t>Baseline (no regularisation)</w:t>
+            </w:r>
+          </w:p>
+        </w:tc>
+        <w:tc>
+          <w:tcPr>
+            <w:tcW w:type="dxa" w:w="2045"/>
+            <w:shd w:val="clear" w:color="auto" w:fill="FFFFFF"/>
+            <w:tcMar>
+              <w:top w:w="35" w:type="dxa"/>
+              <w:bottom w:w="35" w:type="dxa"/>
+              <w:left w:w="70" w:type="dxa"/>
+              <w:right w:w="70" w:type="dxa"/>
+            </w:tcMar>
+          </w:tcPr>
+          <w:p>
+            <w:pPr>
+              <w:jc w:val="left"/>
+            </w:pPr>
+            <w:r>
+              <w:rPr>
+                <w:sz w:val="16"/>
+              </w:rPr>
+              <w:t>Default (2,000 samples, 4x512)</w:t>
+            </w:r>
+          </w:p>
+        </w:tc>
+        <w:tc>
+          <w:tcPr>
+            <w:tcW w:type="dxa" w:w="2045"/>
+            <w:shd w:val="clear" w:color="auto" w:fill="FFFFFF"/>
+            <w:tcMar>
+              <w:top w:w="35" w:type="dxa"/>
+              <w:bottom w:w="35" w:type="dxa"/>
+              <w:left w:w="70" w:type="dxa"/>
+              <w:right w:w="70" w:type="dxa"/>
+            </w:tcMar>
+          </w:tcPr>
+          <w:p>
+            <w:pPr>
+              <w:jc w:val="center"/>
+            </w:pPr>
+            <w:r>
+              <w:rPr>
+                <w:sz w:val="16"/>
+              </w:rPr>
+              <w:t>95.45%</w:t>
+            </w:r>
+          </w:p>
+        </w:tc>
+        <w:tc>
+          <w:tcPr>
+            <w:tcW w:type="dxa" w:w="2045"/>
+            <w:shd w:val="clear" w:color="auto" w:fill="FFFFFF"/>
+            <w:tcMar>
+              <w:top w:w="35" w:type="dxa"/>
+              <w:bottom w:w="35" w:type="dxa"/>
+              <w:left w:w="70" w:type="dxa"/>
+              <w:right w:w="70" w:type="dxa"/>
+            </w:tcMar>
+          </w:tcPr>
+          <w:p>
+            <w:pPr>
+              <w:jc w:val="center"/>
+            </w:pPr>
+            <w:r>
+              <w:rPr>
+                <w:sz w:val="16"/>
+              </w:rPr>
+              <w:t>81.54%</w:t>
+            </w:r>
+          </w:p>
+        </w:tc>
+        <w:tc>
+          <w:tcPr>
+            <w:tcW w:type="dxa" w:w="2045"/>
+            <w:shd w:val="clear" w:color="auto" w:fill="FFFFFF"/>
+            <w:tcMar>
+              <w:top w:w="35" w:type="dxa"/>
+              <w:bottom w:w="35" w:type="dxa"/>
+              <w:left w:w="70" w:type="dxa"/>
+              <w:right w:w="70" w:type="dxa"/>
+            </w:tcMar>
+          </w:tcPr>
+          <w:p>
+            <w:pPr>
+              <w:jc w:val="center"/>
+            </w:pPr>
+            <w:r>
+              <w:rPr>
+                <w:sz w:val="16"/>
+              </w:rPr>
+              <w:t>13.91%</w:t>
+            </w:r>
+          </w:p>
+        </w:tc>
+      </w:tr>
+      <w:tr>
+        <w:tc>
+          <w:tcPr>
+            <w:tcW w:type="dxa" w:w="2045"/>
+            <w:shd w:val="clear" w:color="auto" w:fill="F8FAFC"/>
+            <w:tcMar>
+              <w:top w:w="35" w:type="dxa"/>
+              <w:bottom w:w="35" w:type="dxa"/>
+              <w:left w:w="70" w:type="dxa"/>
+              <w:right w:w="70" w:type="dxa"/>
+            </w:tcMar>
+          </w:tcPr>
+          <w:p>
+            <w:pPr>
+              <w:jc w:val="left"/>
+            </w:pPr>
+            <w:r>
+              <w:rPr>
+                <w:b/>
+                <w:sz w:val="16"/>
+              </w:rPr>
+              <w:t>L2 weight decay</w:t>
+            </w:r>
+          </w:p>
+        </w:tc>
+        <w:tc>
+          <w:tcPr>
+            <w:tcW w:type="dxa" w:w="2045"/>
+            <w:shd w:val="clear" w:color="auto" w:fill="F8FAFC"/>
+            <w:tcMar>
+              <w:top w:w="35" w:type="dxa"/>
+              <w:bottom w:w="35" w:type="dxa"/>
+              <w:left w:w="70" w:type="dxa"/>
+              <w:right w:w="70" w:type="dxa"/>
+            </w:tcMar>
+          </w:tcPr>
+          <w:p>
+            <w:pPr>
+              <w:jc w:val="left"/>
+            </w:pPr>
+            <w:r>
+              <w:rPr>
+                <w:sz w:val="16"/>
+              </w:rPr>
+              <w:t>lambda = 0.0001</w:t>
+            </w:r>
+          </w:p>
+        </w:tc>
+        <w:tc>
+          <w:tcPr>
+            <w:tcW w:type="dxa" w:w="2045"/>
+            <w:shd w:val="clear" w:color="auto" w:fill="F8FAFC"/>
+            <w:tcMar>
+              <w:top w:w="35" w:type="dxa"/>
+              <w:bottom w:w="35" w:type="dxa"/>
+              <w:left w:w="70" w:type="dxa"/>
+              <w:right w:w="70" w:type="dxa"/>
+            </w:tcMar>
+          </w:tcPr>
+          <w:p>
+            <w:pPr>
+              <w:jc w:val="center"/>
+            </w:pPr>
+            <w:r>
+              <w:rPr>
+                <w:sz w:val="16"/>
+              </w:rPr>
+              <w:t>94.10%</w:t>
+            </w:r>
+          </w:p>
+        </w:tc>
+        <w:tc>
+          <w:tcPr>
+            <w:tcW w:type="dxa" w:w="2045"/>
+            <w:shd w:val="clear" w:color="auto" w:fill="F8FAFC"/>
+            <w:tcMar>
+              <w:top w:w="35" w:type="dxa"/>
+              <w:bottom w:w="35" w:type="dxa"/>
+              <w:left w:w="70" w:type="dxa"/>
+              <w:right w:w="70" w:type="dxa"/>
+            </w:tcMar>
+          </w:tcPr>
+          <w:p>
+            <w:pPr>
+              <w:jc w:val="center"/>
+            </w:pPr>
+            <w:r>
+              <w:rPr>
+                <w:sz w:val="16"/>
+              </w:rPr>
+              <w:t>81.58%</w:t>
+            </w:r>
+          </w:p>
+        </w:tc>
+        <w:tc>
+          <w:tcPr>
+            <w:tcW w:type="dxa" w:w="2045"/>
+            <w:shd w:val="clear" w:color="auto" w:fill="F8FAFC"/>
+            <w:tcMar>
+              <w:top w:w="35" w:type="dxa"/>
+              <w:bottom w:w="35" w:type="dxa"/>
+              <w:left w:w="70" w:type="dxa"/>
+              <w:right w:w="70" w:type="dxa"/>
+            </w:tcMar>
+          </w:tcPr>
+          <w:p>
+            <w:pPr>
+              <w:jc w:val="center"/>
+            </w:pPr>
+            <w:r>
+              <w:rPr>
+                <w:sz w:val="16"/>
+              </w:rPr>
+              <w:t>12.52%</w:t>
+            </w:r>
+          </w:p>
+        </w:tc>
+      </w:tr>
+      <w:tr>
+        <w:tc>
+          <w:tcPr>
+            <w:tcW w:type="dxa" w:w="2045"/>
+            <w:shd w:val="clear" w:color="auto" w:fill="FFFFFF"/>
+            <w:tcMar>
+              <w:top w:w="35" w:type="dxa"/>
+              <w:bottom w:w="35" w:type="dxa"/>
+              <w:left w:w="70" w:type="dxa"/>
+              <w:right w:w="70" w:type="dxa"/>
+            </w:tcMar>
+          </w:tcPr>
+          <w:p>
+            <w:pPr>
+              <w:jc w:val="left"/>
+            </w:pPr>
+            <w:r>
+              <w:rPr>
+                <w:b/>
+                <w:sz w:val="16"/>
+              </w:rPr>
+              <w:t>L2 weight decay</w:t>
+            </w:r>
+          </w:p>
+        </w:tc>
+        <w:tc>
+          <w:tcPr>
+            <w:tcW w:type="dxa" w:w="2045"/>
+            <w:shd w:val="clear" w:color="auto" w:fill="FFFFFF"/>
+            <w:tcMar>
+              <w:top w:w="35" w:type="dxa"/>
+              <w:bottom w:w="35" w:type="dxa"/>
+              <w:left w:w="70" w:type="dxa"/>
+              <w:right w:w="70" w:type="dxa"/>
+            </w:tcMar>
+          </w:tcPr>
+          <w:p>
+            <w:pPr>
+              <w:jc w:val="left"/>
+            </w:pPr>
+            <w:r>
+              <w:rPr>
+                <w:sz w:val="16"/>
+              </w:rPr>
+              <w:t>lambda = 0.001</w:t>
+            </w:r>
+          </w:p>
+        </w:tc>
+        <w:tc>
+          <w:tcPr>
+            <w:tcW w:type="dxa" w:w="2045"/>
+            <w:shd w:val="clear" w:color="auto" w:fill="FFFFFF"/>
+            <w:tcMar>
+              <w:top w:w="35" w:type="dxa"/>
+              <w:bottom w:w="35" w:type="dxa"/>
+              <w:left w:w="70" w:type="dxa"/>
+              <w:right w:w="70" w:type="dxa"/>
+            </w:tcMar>
+          </w:tcPr>
+          <w:p>
+            <w:pPr>
+              <w:jc w:val="center"/>
+            </w:pPr>
+            <w:r>
+              <w:rPr>
+                <w:sz w:val="16"/>
+              </w:rPr>
+              <w:t>95.75%</w:t>
+            </w:r>
+          </w:p>
+        </w:tc>
+        <w:tc>
+          <w:tcPr>
+            <w:tcW w:type="dxa" w:w="2045"/>
+            <w:shd w:val="clear" w:color="auto" w:fill="FFFFFF"/>
+            <w:tcMar>
+              <w:top w:w="35" w:type="dxa"/>
+              <w:bottom w:w="35" w:type="dxa"/>
+              <w:left w:w="70" w:type="dxa"/>
+              <w:right w:w="70" w:type="dxa"/>
+            </w:tcMar>
+          </w:tcPr>
+          <w:p>
+            <w:pPr>
+              <w:jc w:val="center"/>
+            </w:pPr>
+            <w:r>
+              <w:rPr>
+                <w:sz w:val="16"/>
+              </w:rPr>
+              <w:t>82.30%</w:t>
+            </w:r>
+          </w:p>
+        </w:tc>
+        <w:tc>
+          <w:tcPr>
+            <w:tcW w:type="dxa" w:w="2045"/>
+            <w:shd w:val="clear" w:color="auto" w:fill="FFFFFF"/>
+            <w:tcMar>
+              <w:top w:w="35" w:type="dxa"/>
+              <w:bottom w:w="35" w:type="dxa"/>
+              <w:left w:w="70" w:type="dxa"/>
+              <w:right w:w="70" w:type="dxa"/>
+            </w:tcMar>
+          </w:tcPr>
+          <w:p>
+            <w:pPr>
+              <w:jc w:val="center"/>
+            </w:pPr>
+            <w:r>
+              <w:rPr>
+                <w:sz w:val="16"/>
+              </w:rPr>
+              <w:t>13.45%</w:t>
+            </w:r>
+          </w:p>
+        </w:tc>
+      </w:tr>
+      <w:tr>
+        <w:tc>
+          <w:tcPr>
+            <w:tcW w:type="dxa" w:w="2045"/>
+            <w:shd w:val="clear" w:color="auto" w:fill="F8FAFC"/>
+            <w:tcMar>
+              <w:top w:w="35" w:type="dxa"/>
+              <w:bottom w:w="35" w:type="dxa"/>
+              <w:left w:w="70" w:type="dxa"/>
+              <w:right w:w="70" w:type="dxa"/>
+            </w:tcMar>
+          </w:tcPr>
+          <w:p>
+            <w:pPr>
+              <w:jc w:val="left"/>
+            </w:pPr>
+            <w:r>
+              <w:rPr>
+                <w:b/>
+                <w:sz w:val="16"/>
+              </w:rPr>
+              <w:t>L2 weight decay</w:t>
+            </w:r>
+          </w:p>
+        </w:tc>
+        <w:tc>
+          <w:tcPr>
+            <w:tcW w:type="dxa" w:w="2045"/>
+            <w:shd w:val="clear" w:color="auto" w:fill="F8FAFC"/>
+            <w:tcMar>
+              <w:top w:w="35" w:type="dxa"/>
+              <w:bottom w:w="35" w:type="dxa"/>
+              <w:left w:w="70" w:type="dxa"/>
+              <w:right w:w="70" w:type="dxa"/>
+            </w:tcMar>
+          </w:tcPr>
+          <w:p>
+            <w:pPr>
+              <w:jc w:val="left"/>
+            </w:pPr>
+            <w:r>
+              <w:rPr>
+                <w:sz w:val="16"/>
+              </w:rPr>
+              <w:t>lambda = 0.01</w:t>
+            </w:r>
+          </w:p>
+        </w:tc>
+        <w:tc>
+          <w:tcPr>
+            <w:tcW w:type="dxa" w:w="2045"/>
+            <w:shd w:val="clear" w:color="auto" w:fill="F8FAFC"/>
+            <w:tcMar>
+              <w:top w:w="35" w:type="dxa"/>
+              <w:bottom w:w="35" w:type="dxa"/>
+              <w:left w:w="70" w:type="dxa"/>
+              <w:right w:w="70" w:type="dxa"/>
+            </w:tcMar>
+          </w:tcPr>
+          <w:p>
+            <w:pPr>
+              <w:jc w:val="center"/>
+            </w:pPr>
+            <w:r>
+              <w:rPr>
+                <w:sz w:val="16"/>
+              </w:rPr>
+              <w:t>89.90%</w:t>
+            </w:r>
+          </w:p>
+        </w:tc>
+        <w:tc>
+          <w:tcPr>
+            <w:tcW w:type="dxa" w:w="2045"/>
+            <w:shd w:val="clear" w:color="auto" w:fill="F8FAFC"/>
+            <w:tcMar>
+              <w:top w:w="35" w:type="dxa"/>
+              <w:bottom w:w="35" w:type="dxa"/>
+              <w:left w:w="70" w:type="dxa"/>
+              <w:right w:w="70" w:type="dxa"/>
+            </w:tcMar>
+          </w:tcPr>
+          <w:p>
+            <w:pPr>
+              <w:jc w:val="center"/>
+            </w:pPr>
+            <w:r>
+              <w:rPr>
+                <w:sz w:val="16"/>
+              </w:rPr>
+              <w:t>79.85%</w:t>
+            </w:r>
+          </w:p>
+        </w:tc>
+        <w:tc>
+          <w:tcPr>
+            <w:tcW w:type="dxa" w:w="2045"/>
+            <w:shd w:val="clear" w:color="auto" w:fill="F8FAFC"/>
+            <w:tcMar>
+              <w:top w:w="35" w:type="dxa"/>
+              <w:bottom w:w="35" w:type="dxa"/>
+              <w:left w:w="70" w:type="dxa"/>
+              <w:right w:w="70" w:type="dxa"/>
+            </w:tcMar>
+          </w:tcPr>
+          <w:p>
+            <w:pPr>
+              <w:jc w:val="center"/>
+            </w:pPr>
+            <w:r>
+              <w:rPr>
+                <w:sz w:val="16"/>
+              </w:rPr>
+              <w:t>10.05%</w:t>
+            </w:r>
+          </w:p>
+        </w:tc>
+      </w:tr>
+      <w:tr>
+        <w:tc>
+          <w:tcPr>
+            <w:tcW w:type="dxa" w:w="2045"/>
+            <w:shd w:val="clear" w:color="auto" w:fill="FFFFFF"/>
+            <w:tcMar>
+              <w:top w:w="35" w:type="dxa"/>
+              <w:bottom w:w="35" w:type="dxa"/>
+              <w:left w:w="70" w:type="dxa"/>
+              <w:right w:w="70" w:type="dxa"/>
+            </w:tcMar>
+          </w:tcPr>
+          <w:p>
+            <w:pPr>
+              <w:jc w:val="left"/>
+            </w:pPr>
+            <w:r>
+              <w:rPr>
+                <w:b/>
+                <w:sz w:val="16"/>
+              </w:rPr>
+              <w:t>L1 penalty</w:t>
+            </w:r>
+          </w:p>
+        </w:tc>
+        <w:tc>
+          <w:tcPr>
+            <w:tcW w:type="dxa" w:w="2045"/>
+            <w:shd w:val="clear" w:color="auto" w:fill="FFFFFF"/>
+            <w:tcMar>
+              <w:top w:w="35" w:type="dxa"/>
+              <w:bottom w:w="35" w:type="dxa"/>
+              <w:left w:w="70" w:type="dxa"/>
+              <w:right w:w="70" w:type="dxa"/>
+            </w:tcMar>
+          </w:tcPr>
+          <w:p>
+            <w:pPr>
+              <w:jc w:val="left"/>
+            </w:pPr>
+            <w:r>
+              <w:rPr>
+                <w:sz w:val="16"/>
+              </w:rPr>
+              <w:t>lambda = 1e-4 (89.7% weights &lt; 1e-3)</w:t>
+            </w:r>
+          </w:p>
+        </w:tc>
+        <w:tc>
+          <w:tcPr>
+            <w:tcW w:type="dxa" w:w="2045"/>
+            <w:shd w:val="clear" w:color="auto" w:fill="FFFFFF"/>
+            <w:tcMar>
+              <w:top w:w="35" w:type="dxa"/>
+              <w:bottom w:w="35" w:type="dxa"/>
+              <w:left w:w="70" w:type="dxa"/>
+              <w:right w:w="70" w:type="dxa"/>
+            </w:tcMar>
+          </w:tcPr>
+          <w:p>
+            <w:pPr>
+              <w:jc w:val="center"/>
+            </w:pPr>
+            <w:r>
+              <w:rPr>
+                <w:sz w:val="16"/>
+              </w:rPr>
+              <w:t>89.80%</w:t>
+            </w:r>
+          </w:p>
+        </w:tc>
+        <w:tc>
+          <w:tcPr>
+            <w:tcW w:type="dxa" w:w="2045"/>
+            <w:shd w:val="clear" w:color="auto" w:fill="FFFFFF"/>
+            <w:tcMar>
+              <w:top w:w="35" w:type="dxa"/>
+              <w:bottom w:w="35" w:type="dxa"/>
+              <w:left w:w="70" w:type="dxa"/>
+              <w:right w:w="70" w:type="dxa"/>
+            </w:tcMar>
+          </w:tcPr>
+          <w:p>
+            <w:pPr>
+              <w:jc w:val="center"/>
+            </w:pPr>
+            <w:r>
+              <w:rPr>
+                <w:sz w:val="16"/>
+              </w:rPr>
+              <w:t>78.94%</w:t>
+            </w:r>
+          </w:p>
+        </w:tc>
+        <w:tc>
+          <w:tcPr>
+            <w:tcW w:type="dxa" w:w="2045"/>
+            <w:shd w:val="clear" w:color="auto" w:fill="FFFFFF"/>
+            <w:tcMar>
+              <w:top w:w="35" w:type="dxa"/>
+              <w:bottom w:w="35" w:type="dxa"/>
+              <w:left w:w="70" w:type="dxa"/>
+              <w:right w:w="70" w:type="dxa"/>
+            </w:tcMar>
+          </w:tcPr>
+          <w:p>
+            <w:pPr>
+              <w:jc w:val="center"/>
+            </w:pPr>
+            <w:r>
+              <w:rPr>
+                <w:sz w:val="16"/>
               </w:rPr>
               <w:t>10.86%</w:t>
             </w:r>
@@ -1641,13 +1641,13 @@
       <w:tr>
         <w:tc>
           <w:tcPr>
-            <w:tcW w:type="dxa" w:w="2016"/>
+            <w:tcW w:type="dxa" w:w="2045"/>
             <w:shd w:val="clear" w:color="auto" w:fill="F8FAFC"/>
             <w:tcMar>
-              <w:top w:w="45" w:type="dxa"/>
-              <w:bottom w:w="45" w:type="dxa"/>
-              <w:left w:w="80" w:type="dxa"/>
-              <w:right w:w="80" w:type="dxa"/>
+              <w:top w:w="35" w:type="dxa"/>
+              <w:bottom w:w="35" w:type="dxa"/>
+              <w:left w:w="70" w:type="dxa"/>
+              <w:right w:w="70" w:type="dxa"/>
             </w:tcMar>
           </w:tcPr>
           <w:p>
@@ -1657,7 +1657,7 @@
             <w:r>
               <w:rPr>
                 <w:b/>
-                <w:sz w:val="17"/>
+                <w:sz w:val="16"/>
               </w:rPr>
               <w:t>Dropout</w:t>
             </w:r>
@@ -1665,13 +1665,13 @@
         </w:tc>
         <w:tc>
           <w:tcPr>
-            <w:tcW w:type="dxa" w:w="2016"/>
+            <w:tcW w:type="dxa" w:w="2045"/>
             <w:shd w:val="clear" w:color="auto" w:fill="F8FAFC"/>
             <w:tcMar>
-              <w:top w:w="45" w:type="dxa"/>
-              <w:bottom w:w="45" w:type="dxa"/>
-              <w:left w:w="80" w:type="dxa"/>
-              <w:right w:w="80" w:type="dxa"/>
+              <w:top w:w="35" w:type="dxa"/>
+              <w:bottom w:w="35" w:type="dxa"/>
+              <w:left w:w="70" w:type="dxa"/>
+              <w:right w:w="70" w:type="dxa"/>
             </w:tcMar>
           </w:tcPr>
           <w:p>
@@ -1680,7 +1680,7 @@
             </w:pPr>
             <w:r>
               <w:rPr>
-                <w:sz w:val="17"/>
+                <w:sz w:val="16"/>
               </w:rPr>
               <w:t>rate p = 0.2</w:t>
             </w:r>
@@ -1688,13 +1688,13 @@
         </w:tc>
         <w:tc>
           <w:tcPr>
-            <w:tcW w:type="dxa" w:w="2016"/>
+            <w:tcW w:type="dxa" w:w="2045"/>
             <w:shd w:val="clear" w:color="auto" w:fill="F8FAFC"/>
             <w:tcMar>
-              <w:top w:w="45" w:type="dxa"/>
-              <w:bottom w:w="45" w:type="dxa"/>
-              <w:left w:w="80" w:type="dxa"/>
-              <w:right w:w="80" w:type="dxa"/>
+              <w:top w:w="35" w:type="dxa"/>
+              <w:bottom w:w="35" w:type="dxa"/>
+              <w:left w:w="70" w:type="dxa"/>
+              <w:right w:w="70" w:type="dxa"/>
             </w:tcMar>
           </w:tcPr>
           <w:p>
@@ -1703,7 +1703,7 @@
             </w:pPr>
             <w:r>
               <w:rPr>
-                <w:sz w:val="17"/>
+                <w:sz w:val="16"/>
               </w:rPr>
               <w:t>93.55%</w:t>
             </w:r>
@@ -1711,13 +1711,13 @@
         </w:tc>
         <w:tc>
           <w:tcPr>
-            <w:tcW w:type="dxa" w:w="2016"/>
+            <w:tcW w:type="dxa" w:w="2045"/>
             <w:shd w:val="clear" w:color="auto" w:fill="F8FAFC"/>
             <w:tcMar>
-              <w:top w:w="45" w:type="dxa"/>
-              <w:bottom w:w="45" w:type="dxa"/>
-              <w:left w:w="80" w:type="dxa"/>
-              <w:right w:w="80" w:type="dxa"/>
+              <w:top w:w="35" w:type="dxa"/>
+              <w:bottom w:w="35" w:type="dxa"/>
+              <w:left w:w="70" w:type="dxa"/>
+              <w:right w:w="70" w:type="dxa"/>
             </w:tcMar>
           </w:tcPr>
           <w:p>
@@ -1726,7 +1726,7 @@
             </w:pPr>
             <w:r>
               <w:rPr>
-                <w:sz w:val="17"/>
+                <w:sz w:val="16"/>
               </w:rPr>
               <w:t>82.34%</w:t>
             </w:r>
@@ -1734,13 +1734,13 @@
         </w:tc>
         <w:tc>
           <w:tcPr>
-            <w:tcW w:type="dxa" w:w="2016"/>
+            <w:tcW w:type="dxa" w:w="2045"/>
             <w:shd w:val="clear" w:color="auto" w:fill="F8FAFC"/>
             <w:tcMar>
-              <w:top w:w="45" w:type="dxa"/>
-              <w:bottom w:w="45" w:type="dxa"/>
-              <w:left w:w="80" w:type="dxa"/>
-              <w:right w:w="80" w:type="dxa"/>
+              <w:top w:w="35" w:type="dxa"/>
+              <w:bottom w:w="35" w:type="dxa"/>
+              <w:left w:w="70" w:type="dxa"/>
+              <w:right w:w="70" w:type="dxa"/>
             </w:tcMar>
           </w:tcPr>
           <w:p>
@@ -1749,7 +1749,7 @@
             </w:pPr>
             <w:r>
               <w:rPr>
-                <w:sz w:val="17"/>
+                <w:sz w:val="16"/>
               </w:rPr>
               <w:t>11.21%</w:t>
             </w:r>
@@ -1759,13 +1759,13 @@
       <w:tr>
         <w:tc>
           <w:tcPr>
-            <w:tcW w:type="dxa" w:w="2016"/>
+            <w:tcW w:type="dxa" w:w="2045"/>
             <w:shd w:val="clear" w:color="auto" w:fill="FFFFFF"/>
             <w:tcMar>
-              <w:top w:w="45" w:type="dxa"/>
-              <w:bottom w:w="45" w:type="dxa"/>
-              <w:left w:w="80" w:type="dxa"/>
-              <w:right w:w="80" w:type="dxa"/>
+              <w:top w:w="35" w:type="dxa"/>
+              <w:bottom w:w="35" w:type="dxa"/>
+              <w:left w:w="70" w:type="dxa"/>
+              <w:right w:w="70" w:type="dxa"/>
             </w:tcMar>
           </w:tcPr>
           <w:p>
@@ -1775,7 +1775,7 @@
             <w:r>
               <w:rPr>
                 <w:b/>
-                <w:sz w:val="17"/>
+                <w:sz w:val="16"/>
               </w:rPr>
               <w:t>Dropout</w:t>
             </w:r>
@@ -1783,13 +1783,13 @@
         </w:tc>
         <w:tc>
           <w:tcPr>
-            <w:tcW w:type="dxa" w:w="2016"/>
+            <w:tcW w:type="dxa" w:w="2045"/>
             <w:shd w:val="clear" w:color="auto" w:fill="FFFFFF"/>
             <w:tcMar>
-              <w:top w:w="45" w:type="dxa"/>
-              <w:bottom w:w="45" w:type="dxa"/>
-              <w:left w:w="80" w:type="dxa"/>
-              <w:right w:w="80" w:type="dxa"/>
+              <w:top w:w="35" w:type="dxa"/>
+              <w:bottom w:w="35" w:type="dxa"/>
+              <w:left w:w="70" w:type="dxa"/>
+              <w:right w:w="70" w:type="dxa"/>
             </w:tcMar>
           </w:tcPr>
           <w:p>
@@ -1798,7 +1798,7 @@
             </w:pPr>
             <w:r>
               <w:rPr>
-                <w:sz w:val="17"/>
+                <w:sz w:val="16"/>
               </w:rPr>
               <w:t>rate p = 0.4</w:t>
             </w:r>
@@ -1806,13 +1806,13 @@
         </w:tc>
         <w:tc>
           <w:tcPr>
-            <w:tcW w:type="dxa" w:w="2016"/>
+            <w:tcW w:type="dxa" w:w="2045"/>
             <w:shd w:val="clear" w:color="auto" w:fill="FFFFFF"/>
             <w:tcMar>
-              <w:top w:w="45" w:type="dxa"/>
-              <w:bottom w:w="45" w:type="dxa"/>
-              <w:left w:w="80" w:type="dxa"/>
-              <w:right w:w="80" w:type="dxa"/>
+              <w:top w:w="35" w:type="dxa"/>
+              <w:bottom w:w="35" w:type="dxa"/>
+              <w:left w:w="70" w:type="dxa"/>
+              <w:right w:w="70" w:type="dxa"/>
             </w:tcMar>
           </w:tcPr>
           <w:p>
@@ -1821,7 +1821,7 @@
             </w:pPr>
             <w:r>
               <w:rPr>
-                <w:sz w:val="17"/>
+                <w:sz w:val="16"/>
               </w:rPr>
               <w:t>93.35%</w:t>
             </w:r>
@@ -1829,13 +1829,13 @@
         </w:tc>
         <w:tc>
           <w:tcPr>
-            <w:tcW w:type="dxa" w:w="2016"/>
+            <w:tcW w:type="dxa" w:w="2045"/>
             <w:shd w:val="clear" w:color="auto" w:fill="FFFFFF"/>
             <w:tcMar>
-              <w:top w:w="45" w:type="dxa"/>
-              <w:bottom w:w="45" w:type="dxa"/>
-              <w:left w:w="80" w:type="dxa"/>
-              <w:right w:w="80" w:type="dxa"/>
+              <w:top w:w="35" w:type="dxa"/>
+              <w:bottom w:w="35" w:type="dxa"/>
+              <w:left w:w="70" w:type="dxa"/>
+              <w:right w:w="70" w:type="dxa"/>
             </w:tcMar>
           </w:tcPr>
           <w:p>
@@ -1844,7 +1844,7 @@
             </w:pPr>
             <w:r>
               <w:rPr>
-                <w:sz w:val="17"/>
+                <w:sz w:val="16"/>
               </w:rPr>
               <w:t>82.97%</w:t>
             </w:r>
@@ -1852,13 +1852,13 @@
         </w:tc>
         <w:tc>
           <w:tcPr>
-            <w:tcW w:type="dxa" w:w="2016"/>
+            <w:tcW w:type="dxa" w:w="2045"/>
             <w:shd w:val="clear" w:color="auto" w:fill="FFFFFF"/>
             <w:tcMar>
-              <w:top w:w="45" w:type="dxa"/>
-              <w:bottom w:w="45" w:type="dxa"/>
-              <w:left w:w="80" w:type="dxa"/>
-              <w:right w:w="80" w:type="dxa"/>
+              <w:top w:w="35" w:type="dxa"/>
+              <w:bottom w:w="35" w:type="dxa"/>
+              <w:left w:w="70" w:type="dxa"/>
+              <w:right w:w="70" w:type="dxa"/>
             </w:tcMar>
           </w:tcPr>
           <w:p>
@@ -1867,7 +1867,7 @@
             </w:pPr>
             <w:r>
               <w:rPr>
-                <w:sz w:val="17"/>
+                <w:sz w:val="16"/>
               </w:rPr>
               <w:t>10.38%</w:t>
             </w:r>
@@ -1877,13 +1877,13 @@
       <w:tr>
         <w:tc>
           <w:tcPr>
-            <w:tcW w:type="dxa" w:w="2016"/>
+            <w:tcW w:type="dxa" w:w="2045"/>
             <w:shd w:val="clear" w:color="auto" w:fill="F8FAFC"/>
             <w:tcMar>
-              <w:top w:w="45" w:type="dxa"/>
-              <w:bottom w:w="45" w:type="dxa"/>
-              <w:left w:w="80" w:type="dxa"/>
-              <w:right w:w="80" w:type="dxa"/>
+              <w:top w:w="35" w:type="dxa"/>
+              <w:bottom w:w="35" w:type="dxa"/>
+              <w:left w:w="70" w:type="dxa"/>
+              <w:right w:w="70" w:type="dxa"/>
             </w:tcMar>
           </w:tcPr>
           <w:p>
@@ -1893,7 +1893,7 @@
             <w:r>
               <w:rPr>
                 <w:b/>
-                <w:sz w:val="17"/>
+                <w:sz w:val="16"/>
               </w:rPr>
               <w:t>Dropout</w:t>
             </w:r>
@@ -1901,13 +1901,13 @@
         </w:tc>
         <w:tc>
           <w:tcPr>
-            <w:tcW w:type="dxa" w:w="2016"/>
+            <w:tcW w:type="dxa" w:w="2045"/>
             <w:shd w:val="clear" w:color="auto" w:fill="F8FAFC"/>
             <w:tcMar>
-              <w:top w:w="45" w:type="dxa"/>
-              <w:bottom w:w="45" w:type="dxa"/>
-              <w:left w:w="80" w:type="dxa"/>
-              <w:right w:w="80" w:type="dxa"/>
+              <w:top w:w="35" w:type="dxa"/>
+              <w:bottom w:w="35" w:type="dxa"/>
+              <w:left w:w="70" w:type="dxa"/>
+              <w:right w:w="70" w:type="dxa"/>
             </w:tcMar>
           </w:tcPr>
           <w:p>
@@ -1916,7 +1916,7 @@
             </w:pPr>
             <w:r>
               <w:rPr>
-                <w:sz w:val="17"/>
+                <w:sz w:val="16"/>
               </w:rPr>
               <w:t>rate p = 0.6</w:t>
             </w:r>
@@ -1924,13 +1924,13 @@
         </w:tc>
         <w:tc>
           <w:tcPr>
-            <w:tcW w:type="dxa" w:w="2016"/>
+            <w:tcW w:type="dxa" w:w="2045"/>
             <w:shd w:val="clear" w:color="auto" w:fill="F8FAFC"/>
             <w:tcMar>
-              <w:top w:w="45" w:type="dxa"/>
-              <w:bottom w:w="45" w:type="dxa"/>
-              <w:left w:w="80" w:type="dxa"/>
-              <w:right w:w="80" w:type="dxa"/>
+              <w:top w:w="35" w:type="dxa"/>
+              <w:bottom w:w="35" w:type="dxa"/>
+              <w:left w:w="70" w:type="dxa"/>
+              <w:right w:w="70" w:type="dxa"/>
             </w:tcMar>
           </w:tcPr>
           <w:p>
@@ -1939,7 +1939,7 @@
             </w:pPr>
             <w:r>
               <w:rPr>
-                <w:sz w:val="17"/>
+                <w:sz w:val="16"/>
               </w:rPr>
               <w:t>89.05%</w:t>
             </w:r>
@@ -1947,13 +1947,13 @@
         </w:tc>
         <w:tc>
           <w:tcPr>
-            <w:tcW w:type="dxa" w:w="2016"/>
+            <w:tcW w:type="dxa" w:w="2045"/>
             <w:shd w:val="clear" w:color="auto" w:fill="F8FAFC"/>
             <w:tcMar>
-              <w:top w:w="45" w:type="dxa"/>
-              <w:bottom w:w="45" w:type="dxa"/>
-              <w:left w:w="80" w:type="dxa"/>
-              <w:right w:w="80" w:type="dxa"/>
+              <w:top w:w="35" w:type="dxa"/>
+              <w:bottom w:w="35" w:type="dxa"/>
+              <w:left w:w="70" w:type="dxa"/>
+              <w:right w:w="70" w:type="dxa"/>
             </w:tcMar>
           </w:tcPr>
           <w:p>
@@ -1962,7 +1962,7 @@
             </w:pPr>
             <w:r>
               <w:rPr>
-                <w:sz w:val="17"/>
+                <w:sz w:val="16"/>
               </w:rPr>
               <w:t>82.56%</w:t>
             </w:r>
@@ -1970,13 +1970,13 @@
         </w:tc>
         <w:tc>
           <w:tcPr>
-            <w:tcW w:type="dxa" w:w="2016"/>
+            <w:tcW w:type="dxa" w:w="2045"/>
             <w:shd w:val="clear" w:color="auto" w:fill="F8FAFC"/>
             <w:tcMar>
-              <w:top w:w="45" w:type="dxa"/>
-              <w:bottom w:w="45" w:type="dxa"/>
-              <w:left w:w="80" w:type="dxa"/>
-              <w:right w:w="80" w:type="dxa"/>
+              <w:top w:w="35" w:type="dxa"/>
+              <w:bottom w:w="35" w:type="dxa"/>
+              <w:left w:w="70" w:type="dxa"/>
+              <w:right w:w="70" w:type="dxa"/>
             </w:tcMar>
           </w:tcPr>
           <w:p>
@@ -1985,7 +1985,7 @@
             </w:pPr>
             <w:r>
               <w:rPr>
-                <w:sz w:val="17"/>
+                <w:sz w:val="16"/>
               </w:rPr>
               <w:t>6.49%</w:t>
             </w:r>
@@ -1995,13 +1995,13 @@
       <w:tr>
         <w:tc>
           <w:tcPr>
-            <w:tcW w:type="dxa" w:w="2016"/>
+            <w:tcW w:type="dxa" w:w="2045"/>
             <w:shd w:val="clear" w:color="auto" w:fill="FFFFFF"/>
             <w:tcMar>
-              <w:top w:w="45" w:type="dxa"/>
-              <w:bottom w:w="45" w:type="dxa"/>
-              <w:left w:w="80" w:type="dxa"/>
-              <w:right w:w="80" w:type="dxa"/>
+              <w:top w:w="35" w:type="dxa"/>
+              <w:bottom w:w="35" w:type="dxa"/>
+              <w:left w:w="70" w:type="dxa"/>
+              <w:right w:w="70" w:type="dxa"/>
             </w:tcMar>
           </w:tcPr>
           <w:p>
@@ -2011,7 +2011,7 @@
             <w:r>
               <w:rPr>
                 <w:b/>
-                <w:sz w:val="17"/>
+                <w:sz w:val="16"/>
               </w:rPr>
               <w:t>Batch normalisation</w:t>
             </w:r>
@@ -2019,13 +2019,13 @@
         </w:tc>
         <w:tc>
           <w:tcPr>
-            <w:tcW w:type="dxa" w:w="2016"/>
+            <w:tcW w:type="dxa" w:w="2045"/>
             <w:shd w:val="clear" w:color="auto" w:fill="FFFFFF"/>
             <w:tcMar>
-              <w:top w:w="45" w:type="dxa"/>
-              <w:bottom w:w="45" w:type="dxa"/>
-              <w:left w:w="80" w:type="dxa"/>
-              <w:right w:w="80" w:type="dxa"/>
+              <w:top w:w="35" w:type="dxa"/>
+              <w:bottom w:w="35" w:type="dxa"/>
+              <w:left w:w="70" w:type="dxa"/>
+              <w:right w:w="70" w:type="dxa"/>
             </w:tcMar>
           </w:tcPr>
           <w:p>
@@ -2034,7 +2034,7 @@
             </w:pPr>
             <w:r>
               <w:rPr>
-                <w:sz w:val="17"/>
+                <w:sz w:val="16"/>
               </w:rPr>
               <w:t>BatchNorm1d on hidden layers</w:t>
             </w:r>
@@ -2042,13 +2042,13 @@
         </w:tc>
         <w:tc>
           <w:tcPr>
-            <w:tcW w:type="dxa" w:w="2016"/>
+            <w:tcW w:type="dxa" w:w="2045"/>
             <w:shd w:val="clear" w:color="auto" w:fill="FFFFFF"/>
             <w:tcMar>
-              <w:top w:w="45" w:type="dxa"/>
-              <w:bottom w:w="45" w:type="dxa"/>
-              <w:left w:w="80" w:type="dxa"/>
-              <w:right w:w="80" w:type="dxa"/>
+              <w:top w:w="35" w:type="dxa"/>
+              <w:bottom w:w="35" w:type="dxa"/>
+              <w:left w:w="70" w:type="dxa"/>
+              <w:right w:w="70" w:type="dxa"/>
             </w:tcMar>
           </w:tcPr>
           <w:p>
@@ -2057,7 +2057,7 @@
             </w:pPr>
             <w:r>
               <w:rPr>
-                <w:sz w:val="17"/>
+                <w:sz w:val="16"/>
               </w:rPr>
               <w:t>99.35%</w:t>
             </w:r>
@@ -2065,13 +2065,13 @@
         </w:tc>
         <w:tc>
           <w:tcPr>
-            <w:tcW w:type="dxa" w:w="2016"/>
+            <w:tcW w:type="dxa" w:w="2045"/>
             <w:shd w:val="clear" w:color="auto" w:fill="FFFFFF"/>
             <w:tcMar>
-              <w:top w:w="45" w:type="dxa"/>
-              <w:bottom w:w="45" w:type="dxa"/>
-              <w:left w:w="80" w:type="dxa"/>
-              <w:right w:w="80" w:type="dxa"/>
+              <w:top w:w="35" w:type="dxa"/>
+              <w:bottom w:w="35" w:type="dxa"/>
+              <w:left w:w="70" w:type="dxa"/>
+              <w:right w:w="70" w:type="dxa"/>
             </w:tcMar>
           </w:tcPr>
           <w:p>
@@ -2080,7 +2080,7 @@
             </w:pPr>
             <w:r>
               <w:rPr>
-                <w:sz w:val="17"/>
+                <w:sz w:val="16"/>
               </w:rPr>
               <w:t>81.92%</w:t>
             </w:r>
@@ -2088,13 +2088,13 @@
         </w:tc>
         <w:tc>
           <w:tcPr>
-            <w:tcW w:type="dxa" w:w="2016"/>
+            <w:tcW w:type="dxa" w:w="2045"/>
             <w:shd w:val="clear" w:color="auto" w:fill="FFFFFF"/>
             <w:tcMar>
-              <w:top w:w="45" w:type="dxa"/>
-              <w:bottom w:w="45" w:type="dxa"/>
-              <w:left w:w="80" w:type="dxa"/>
-              <w:right w:w="80" w:type="dxa"/>
+              <w:top w:w="35" w:type="dxa"/>
+              <w:bottom w:w="35" w:type="dxa"/>
+              <w:left w:w="70" w:type="dxa"/>
+              <w:right w:w="70" w:type="dxa"/>
             </w:tcMar>
           </w:tcPr>
           <w:p>
@@ -2103,7 +2103,7 @@
             </w:pPr>
             <w:r>
               <w:rPr>
-                <w:sz w:val="17"/>
+                <w:sz w:val="16"/>
               </w:rPr>
               <w:t>17.43%</w:t>
             </w:r>
@@ -2113,13 +2113,13 @@
       <w:tr>
         <w:tc>
           <w:tcPr>
-            <w:tcW w:type="dxa" w:w="2016"/>
+            <w:tcW w:type="dxa" w:w="2045"/>
             <w:shd w:val="clear" w:color="auto" w:fill="F8FAFC"/>
             <w:tcMar>
-              <w:top w:w="45" w:type="dxa"/>
-              <w:bottom w:w="45" w:type="dxa"/>
-              <w:left w:w="80" w:type="dxa"/>
-              <w:right w:w="80" w:type="dxa"/>
+              <w:top w:w="35" w:type="dxa"/>
+              <w:bottom w:w="35" w:type="dxa"/>
+              <w:left w:w="70" w:type="dxa"/>
+              <w:right w:w="70" w:type="dxa"/>
             </w:tcMar>
           </w:tcPr>
           <w:p>
@@ -2129,7 +2129,7 @@
             <w:r>
               <w:rPr>
                 <w:b/>
-                <w:sz w:val="17"/>
+                <w:sz w:val="16"/>
               </w:rPr>
               <w:t>Early stopping</w:t>
             </w:r>
@@ -2137,13 +2137,13 @@
         </w:tc>
         <w:tc>
           <w:tcPr>
-            <w:tcW w:type="dxa" w:w="2016"/>
+            <w:tcW w:type="dxa" w:w="2045"/>
             <w:shd w:val="clear" w:color="auto" w:fill="F8FAFC"/>
             <w:tcMar>
-              <w:top w:w="45" w:type="dxa"/>
-              <w:bottom w:w="45" w:type="dxa"/>
-              <w:left w:w="80" w:type="dxa"/>
-              <w:right w:w="80" w:type="dxa"/>
+              <w:top w:w="35" w:type="dxa"/>
+              <w:bottom w:w="35" w:type="dxa"/>
+              <w:left w:w="70" w:type="dxa"/>
+              <w:right w:w="70" w:type="dxa"/>
             </w:tcMar>
           </w:tcPr>
           <w:p>
@@ -2152,7 +2152,7 @@
             </w:pPr>
             <w:r>
               <w:rPr>
-                <w:sz w:val="17"/>
+                <w:sz w:val="16"/>
               </w:rPr>
               <w:t>Patience = 5, stopped at epoch 12</w:t>
             </w:r>
@@ -2160,13 +2160,13 @@
         </w:tc>
         <w:tc>
           <w:tcPr>
-            <w:tcW w:type="dxa" w:w="2016"/>
+            <w:tcW w:type="dxa" w:w="2045"/>
             <w:shd w:val="clear" w:color="auto" w:fill="F8FAFC"/>
             <w:tcMar>
-              <w:top w:w="45" w:type="dxa"/>
-              <w:bottom w:w="45" w:type="dxa"/>
-              <w:left w:w="80" w:type="dxa"/>
-              <w:right w:w="80" w:type="dxa"/>
+              <w:top w:w="35" w:type="dxa"/>
+              <w:bottom w:w="35" w:type="dxa"/>
+              <w:left w:w="70" w:type="dxa"/>
+              <w:right w:w="70" w:type="dxa"/>
             </w:tcMar>
           </w:tcPr>
           <w:p>
@@ -2175,7 +2175,7 @@
             </w:pPr>
             <w:r>
               <w:rPr>
-                <w:sz w:val="17"/>
+                <w:sz w:val="16"/>
               </w:rPr>
               <w:t>83.35%</w:t>
             </w:r>
@@ -2183,13 +2183,13 @@
         </w:tc>
         <w:tc>
           <w:tcPr>
-            <w:tcW w:type="dxa" w:w="2016"/>
+            <w:tcW w:type="dxa" w:w="2045"/>
             <w:shd w:val="clear" w:color="auto" w:fill="F8FAFC"/>
             <w:tcMar>
-              <w:top w:w="45" w:type="dxa"/>
-              <w:bottom w:w="45" w:type="dxa"/>
-              <w:left w:w="80" w:type="dxa"/>
-              <w:right w:w="80" w:type="dxa"/>
+              <w:top w:w="35" w:type="dxa"/>
+              <w:bottom w:w="35" w:type="dxa"/>
+              <w:left w:w="70" w:type="dxa"/>
+              <w:right w:w="70" w:type="dxa"/>
             </w:tcMar>
           </w:tcPr>
           <w:p>
@@ -2198,7 +2198,7 @@
             </w:pPr>
             <w:r>
               <w:rPr>
-                <w:sz w:val="17"/>
+                <w:sz w:val="16"/>
               </w:rPr>
               <w:t>77.08%</w:t>
             </w:r>
@@ -2206,13 +2206,13 @@
         </w:tc>
         <w:tc>
           <w:tcPr>
-            <w:tcW w:type="dxa" w:w="2016"/>
+            <w:tcW w:type="dxa" w:w="2045"/>
             <w:shd w:val="clear" w:color="auto" w:fill="F8FAFC"/>
             <w:tcMar>
-              <w:top w:w="45" w:type="dxa"/>
-              <w:bottom w:w="45" w:type="dxa"/>
-              <w:left w:w="80" w:type="dxa"/>
-              <w:right w:w="80" w:type="dxa"/>
+              <w:top w:w="35" w:type="dxa"/>
+              <w:bottom w:w="35" w:type="dxa"/>
+              <w:left w:w="70" w:type="dxa"/>
+              <w:right w:w="70" w:type="dxa"/>
             </w:tcMar>
           </w:tcPr>
           <w:p>
@@ -2221,7 +2221,7 @@
             </w:pPr>
             <w:r>
               <w:rPr>
-                <w:sz w:val="17"/>
+                <w:sz w:val="16"/>
               </w:rPr>
               <w:t>6.27%</w:t>
             </w:r>
@@ -2231,13 +2231,13 @@
       <w:tr>
         <w:tc>
           <w:tcPr>
-            <w:tcW w:type="dxa" w:w="2016"/>
+            <w:tcW w:type="dxa" w:w="2045"/>
             <w:shd w:val="clear" w:color="auto" w:fill="FFFFFF"/>
             <w:tcMar>
-              <w:top w:w="45" w:type="dxa"/>
-              <w:bottom w:w="45" w:type="dxa"/>
-              <w:left w:w="80" w:type="dxa"/>
-              <w:right w:w="80" w:type="dxa"/>
+              <w:top w:w="35" w:type="dxa"/>
+              <w:bottom w:w="35" w:type="dxa"/>
+              <w:left w:w="70" w:type="dxa"/>
+              <w:right w:w="70" w:type="dxa"/>
             </w:tcMar>
           </w:tcPr>
           <w:p>
@@ -2247,7 +2247,7 @@
             <w:r>
               <w:rPr>
                 <w:b/>
-                <w:sz w:val="17"/>
+                <w:sz w:val="16"/>
               </w:rPr>
               <w:t>Data augmentation</w:t>
             </w:r>
@@ -2255,13 +2255,13 @@
         </w:tc>
         <w:tc>
           <w:tcPr>
-            <w:tcW w:type="dxa" w:w="2016"/>
+            <w:tcW w:type="dxa" w:w="2045"/>
             <w:shd w:val="clear" w:color="auto" w:fill="FFFFFF"/>
             <w:tcMar>
-              <w:top w:w="45" w:type="dxa"/>
-              <w:bottom w:w="45" w:type="dxa"/>
-              <w:left w:w="80" w:type="dxa"/>
-              <w:right w:w="80" w:type="dxa"/>
+              <w:top w:w="35" w:type="dxa"/>
+              <w:bottom w:w="35" w:type="dxa"/>
+              <w:left w:w="70" w:type="dxa"/>
+              <w:right w:w="70" w:type="dxa"/>
             </w:tcMar>
           </w:tcPr>
           <w:p>
@@ -2270,7 +2270,7 @@
             </w:pPr>
             <w:r>
               <w:rPr>
-                <w:sz w:val="17"/>
+                <w:sz w:val="16"/>
               </w:rPr>
               <w:t>Random horizontal flip + 10 deg rotation</w:t>
             </w:r>
@@ -2278,13 +2278,13 @@
         </w:tc>
         <w:tc>
           <w:tcPr>
-            <w:tcW w:type="dxa" w:w="2016"/>
+            <w:tcW w:type="dxa" w:w="2045"/>
             <w:shd w:val="clear" w:color="auto" w:fill="FFFFFF"/>
             <w:tcMar>
-              <w:top w:w="45" w:type="dxa"/>
-              <w:bottom w:w="45" w:type="dxa"/>
-              <w:left w:w="80" w:type="dxa"/>
-              <w:right w:w="80" w:type="dxa"/>
+              <w:top w:w="35" w:type="dxa"/>
+              <w:bottom w:w="35" w:type="dxa"/>
+              <w:left w:w="70" w:type="dxa"/>
+              <w:right w:w="70" w:type="dxa"/>
             </w:tcMar>
           </w:tcPr>
           <w:p>
@@ -2293,7 +2293,7 @@
             </w:pPr>
             <w:r>
               <w:rPr>
-                <w:sz w:val="17"/>
+                <w:sz w:val="16"/>
               </w:rPr>
               <w:t>97.95%</w:t>
             </w:r>
@@ -2301,13 +2301,13 @@
         </w:tc>
         <w:tc>
           <w:tcPr>
-            <w:tcW w:type="dxa" w:w="2016"/>
+            <w:tcW w:type="dxa" w:w="2045"/>
             <w:shd w:val="clear" w:color="auto" w:fill="FFFFFF"/>
             <w:tcMar>
-              <w:top w:w="45" w:type="dxa"/>
-              <w:bottom w:w="45" w:type="dxa"/>
-              <w:left w:w="80" w:type="dxa"/>
-              <w:right w:w="80" w:type="dxa"/>
+              <w:top w:w="35" w:type="dxa"/>
+              <w:bottom w:w="35" w:type="dxa"/>
+              <w:left w:w="70" w:type="dxa"/>
+              <w:right w:w="70" w:type="dxa"/>
             </w:tcMar>
           </w:tcPr>
           <w:p>
@@ -2316,7 +2316,7 @@
             </w:pPr>
             <w:r>
               <w:rPr>
-                <w:sz w:val="17"/>
+                <w:sz w:val="16"/>
               </w:rPr>
               <w:t>83.80%</w:t>
             </w:r>
@@ -2324,13 +2324,13 @@
         </w:tc>
         <w:tc>
           <w:tcPr>
-            <w:tcW w:type="dxa" w:w="2016"/>
+            <w:tcW w:type="dxa" w:w="2045"/>
             <w:shd w:val="clear" w:color="auto" w:fill="FFFFFF"/>
             <w:tcMar>
-              <w:top w:w="45" w:type="dxa"/>
-              <w:bottom w:w="45" w:type="dxa"/>
-              <w:left w:w="80" w:type="dxa"/>
-              <w:right w:w="80" w:type="dxa"/>
+              <w:top w:w="35" w:type="dxa"/>
+              <w:bottom w:w="35" w:type="dxa"/>
+              <w:left w:w="70" w:type="dxa"/>
+              <w:right w:w="70" w:type="dxa"/>
             </w:tcMar>
           </w:tcPr>
           <w:p>
@@ -2339,7 +2339,7 @@
             </w:pPr>
             <w:r>
               <w:rPr>
-                <w:sz w:val="17"/>
+                <w:sz w:val="16"/>
               </w:rPr>
               <w:t>14.15%</w:t>
             </w:r>
@@ -2349,13 +2349,13 @@
       <w:tr>
         <w:tc>
           <w:tcPr>
-            <w:tcW w:type="dxa" w:w="2016"/>
+            <w:tcW w:type="dxa" w:w="2045"/>
             <w:shd w:val="clear" w:color="auto" w:fill="F8FAFC"/>
             <w:tcMar>
-              <w:top w:w="45" w:type="dxa"/>
-              <w:bottom w:w="45" w:type="dxa"/>
-              <w:left w:w="80" w:type="dxa"/>
-              <w:right w:w="80" w:type="dxa"/>
+              <w:top w:w="35" w:type="dxa"/>
+              <w:bottom w:w="35" w:type="dxa"/>
+              <w:left w:w="70" w:type="dxa"/>
+              <w:right w:w="70" w:type="dxa"/>
             </w:tcMar>
           </w:tcPr>
           <w:p>
@@ -2365,7 +2365,7 @@
             <w:r>
               <w:rPr>
                 <w:b/>
-                <w:sz w:val="17"/>
+                <w:sz w:val="16"/>
               </w:rPr>
               <w:t>More training data</w:t>
             </w:r>
@@ -2373,13 +2373,13 @@
         </w:tc>
         <w:tc>
           <w:tcPr>
-            <w:tcW w:type="dxa" w:w="2016"/>
+            <w:tcW w:type="dxa" w:w="2045"/>
             <w:shd w:val="clear" w:color="auto" w:fill="F8FAFC"/>
             <w:tcMar>
-              <w:top w:w="45" w:type="dxa"/>
-              <w:bottom w:w="45" w:type="dxa"/>
-              <w:left w:w="80" w:type="dxa"/>
-              <w:right w:w="80" w:type="dxa"/>
+              <w:top w:w="35" w:type="dxa"/>
+              <w:bottom w:w="35" w:type="dxa"/>
+              <w:left w:w="70" w:type="dxa"/>
+              <w:right w:w="70" w:type="dxa"/>
             </w:tcMar>
           </w:tcPr>
           <w:p>
@@ -2388,7 +2388,7 @@
             </w:pPr>
             <w:r>
               <w:rPr>
-                <w:sz w:val="17"/>
+                <w:sz w:val="16"/>
               </w:rPr>
               <w:t>N = 10000 samples</w:t>
             </w:r>
@@ -2396,13 +2396,13 @@
         </w:tc>
         <w:tc>
           <w:tcPr>
-            <w:tcW w:type="dxa" w:w="2016"/>
+            <w:tcW w:type="dxa" w:w="2045"/>
             <w:shd w:val="clear" w:color="auto" w:fill="F8FAFC"/>
             <w:tcMar>
-              <w:top w:w="45" w:type="dxa"/>
-              <w:bottom w:w="45" w:type="dxa"/>
-              <w:left w:w="80" w:type="dxa"/>
-              <w:right w:w="80" w:type="dxa"/>
+              <w:top w:w="35" w:type="dxa"/>
+              <w:bottom w:w="35" w:type="dxa"/>
+              <w:left w:w="70" w:type="dxa"/>
+              <w:right w:w="70" w:type="dxa"/>
             </w:tcMar>
           </w:tcPr>
           <w:p>
@@ -2411,7 +2411,7 @@
             </w:pPr>
             <w:r>
               <w:rPr>
-                <w:sz w:val="17"/>
+                <w:sz w:val="16"/>
               </w:rPr>
               <w:t>95.69%</w:t>
             </w:r>
@@ -2419,13 +2419,13 @@
         </w:tc>
         <w:tc>
           <w:tcPr>
-            <w:tcW w:type="dxa" w:w="2016"/>
+            <w:tcW w:type="dxa" w:w="2045"/>
             <w:shd w:val="clear" w:color="auto" w:fill="F8FAFC"/>
             <w:tcMar>
-              <w:top w:w="45" w:type="dxa"/>
-              <w:bottom w:w="45" w:type="dxa"/>
-              <w:left w:w="80" w:type="dxa"/>
-              <w:right w:w="80" w:type="dxa"/>
+              <w:top w:w="35" w:type="dxa"/>
+              <w:bottom w:w="35" w:type="dxa"/>
+              <w:left w:w="70" w:type="dxa"/>
+              <w:right w:w="70" w:type="dxa"/>
             </w:tcMar>
           </w:tcPr>
           <w:p>
@@ -2434,7 +2434,7 @@
             </w:pPr>
             <w:r>
               <w:rPr>
-                <w:sz w:val="17"/>
+                <w:sz w:val="16"/>
               </w:rPr>
               <w:t>86.67%</w:t>
             </w:r>
@@ -2442,13 +2442,13 @@
         </w:tc>
         <w:tc>
           <w:tcPr>
-            <w:tcW w:type="dxa" w:w="2016"/>
+            <w:tcW w:type="dxa" w:w="2045"/>
             <w:shd w:val="clear" w:color="auto" w:fill="F8FAFC"/>
             <w:tcMar>
-              <w:top w:w="45" w:type="dxa"/>
-              <w:bottom w:w="45" w:type="dxa"/>
-              <w:left w:w="80" w:type="dxa"/>
-              <w:right w:w="80" w:type="dxa"/>
+              <w:top w:w="35" w:type="dxa"/>
+              <w:bottom w:w="35" w:type="dxa"/>
+              <w:left w:w="70" w:type="dxa"/>
+              <w:right w:w="70" w:type="dxa"/>
             </w:tcMar>
           </w:tcPr>
           <w:p>
@@ -2457,7 +2457,7 @@
             </w:pPr>
             <w:r>
               <w:rPr>
-                <w:sz w:val="17"/>
+                <w:sz w:val="16"/>
               </w:rPr>
               <w:t>9.02%</w:t>
             </w:r>
@@ -2467,13 +2467,13 @@
       <w:tr>
         <w:tc>
           <w:tcPr>
-            <w:tcW w:type="dxa" w:w="2016"/>
+            <w:tcW w:type="dxa" w:w="2045"/>
             <w:shd w:val="clear" w:color="auto" w:fill="FFFFFF"/>
             <w:tcMar>
-              <w:top w:w="45" w:type="dxa"/>
-              <w:bottom w:w="45" w:type="dxa"/>
-              <w:left w:w="80" w:type="dxa"/>
-              <w:right w:w="80" w:type="dxa"/>
+              <w:top w:w="35" w:type="dxa"/>
+              <w:bottom w:w="35" w:type="dxa"/>
+              <w:left w:w="70" w:type="dxa"/>
+              <w:right w:w="70" w:type="dxa"/>
             </w:tcMar>
           </w:tcPr>
           <w:p>
@@ -2483,7 +2483,7 @@
             <w:r>
               <w:rPr>
                 <w:b/>
-                <w:sz w:val="17"/>
+                <w:sz w:val="16"/>
               </w:rPr>
               <w:t>More training data</w:t>
             </w:r>
@@ -2491,13 +2491,13 @@
         </w:tc>
         <w:tc>
           <w:tcPr>
-            <w:tcW w:type="dxa" w:w="2016"/>
+            <w:tcW w:type="dxa" w:w="2045"/>
             <w:shd w:val="clear" w:color="auto" w:fill="FFFFFF"/>
             <w:tcMar>
-              <w:top w:w="45" w:type="dxa"/>
-              <w:bottom w:w="45" w:type="dxa"/>
-              <w:left w:w="80" w:type="dxa"/>
-              <w:right w:w="80" w:type="dxa"/>
+              <w:top w:w="35" w:type="dxa"/>
+              <w:bottom w:w="35" w:type="dxa"/>
+              <w:left w:w="70" w:type="dxa"/>
+              <w:right w:w="70" w:type="dxa"/>
             </w:tcMar>
           </w:tcPr>
           <w:p>
@@ -2506,7 +2506,7 @@
             </w:pPr>
             <w:r>
               <w:rPr>
-                <w:sz w:val="17"/>
+                <w:sz w:val="16"/>
               </w:rPr>
               <w:t>N = 20000 samples</w:t>
             </w:r>
@@ -2514,13 +2514,13 @@
         </w:tc>
         <w:tc>
           <w:tcPr>
-            <w:tcW w:type="dxa" w:w="2016"/>
+            <w:tcW w:type="dxa" w:w="2045"/>
             <w:shd w:val="clear" w:color="auto" w:fill="FFFFFF"/>
             <w:tcMar>
-              <w:top w:w="45" w:type="dxa"/>
-              <w:bottom w:w="45" w:type="dxa"/>
-              <w:left w:w="80" w:type="dxa"/>
-              <w:right w:w="80" w:type="dxa"/>
+              <w:top w:w="35" w:type="dxa"/>
+              <w:bottom w:w="35" w:type="dxa"/>
+              <w:left w:w="70" w:type="dxa"/>
+              <w:right w:w="70" w:type="dxa"/>
             </w:tcMar>
           </w:tcPr>
           <w:p>
@@ -2529,7 +2529,7 @@
             </w:pPr>
             <w:r>
               <w:rPr>
-                <w:sz w:val="17"/>
+                <w:sz w:val="16"/>
               </w:rPr>
               <w:t>96.24%</w:t>
             </w:r>
@@ -2537,13 +2537,13 @@
         </w:tc>
         <w:tc>
           <w:tcPr>
-            <w:tcW w:type="dxa" w:w="2016"/>
+            <w:tcW w:type="dxa" w:w="2045"/>
             <w:shd w:val="clear" w:color="auto" w:fill="FFFFFF"/>
             <w:tcMar>
-              <w:top w:w="45" w:type="dxa"/>
-              <w:bottom w:w="45" w:type="dxa"/>
-              <w:left w:w="80" w:type="dxa"/>
-              <w:right w:w="80" w:type="dxa"/>
+              <w:top w:w="35" w:type="dxa"/>
+              <w:bottom w:w="35" w:type="dxa"/>
+              <w:left w:w="70" w:type="dxa"/>
+              <w:right w:w="70" w:type="dxa"/>
             </w:tcMar>
           </w:tcPr>
           <w:p>
@@ -2552,7 +2552,7 @@
             </w:pPr>
             <w:r>
               <w:rPr>
-                <w:sz w:val="17"/>
+                <w:sz w:val="16"/>
               </w:rPr>
               <w:t>87.58%</w:t>
             </w:r>
@@ -2560,13 +2560,13 @@
         </w:tc>
         <w:tc>
           <w:tcPr>
-            <w:tcW w:type="dxa" w:w="2016"/>
+            <w:tcW w:type="dxa" w:w="2045"/>
             <w:shd w:val="clear" w:color="auto" w:fill="FFFFFF"/>
             <w:tcMar>
-              <w:top w:w="45" w:type="dxa"/>
-              <w:bottom w:w="45" w:type="dxa"/>
-              <w:left w:w="80" w:type="dxa"/>
-              <w:right w:w="80" w:type="dxa"/>
+              <w:top w:w="35" w:type="dxa"/>
+              <w:bottom w:w="35" w:type="dxa"/>
+              <w:left w:w="70" w:type="dxa"/>
+              <w:right w:w="70" w:type="dxa"/>
             </w:tcMar>
           </w:tcPr>
           <w:p>
@@ -2575,7 +2575,7 @@
             </w:pPr>
             <w:r>
               <w:rPr>
-                <w:sz w:val="17"/>
+                <w:sz w:val="16"/>
               </w:rPr>
               <w:t>8.67%</w:t>
             </w:r>
@@ -2585,18 +2585,18 @@
     </w:tbl>
     <w:p>
       <w:pPr>
-        <w:spacing w:before="60" w:after="80"/>
+        <w:spacing w:before="60" w:after="60"/>
       </w:pPr>
       <w:r>
         <w:rPr>
           <w:b/>
-          <w:sz w:val="19"/>
+          <w:sz w:val="18"/>
         </w:rPr>
         <w:t xml:space="preserve">Comparison of Regularisation Methods (Under 150 Words): </w:t>
       </w:r>
       <w:r>
         <w:rPr>
-          <w:sz w:val="19"/>
+          <w:sz w:val="18"/>
         </w:rPr>
         <w:t>Among algorithmic regularizers, Dropout (p=0.4) offered a solid balance, reducing the generalization gap to 10.38% while maintaining 93.35% training accuracy. However, scaling training data was by far the most effective intervention. Increasing the dataset from 2,000 to 20,000 samples dropped the generalization gap down to 8.67% while pushing validation accuracy to a study-high 87.58% without degrading training fit (96.24%). Unlike penalty-based regularizers that narrow the gap by forcing underfitting, larger datasets directly resolve high variance by exposing the network to genuine pattern diversity.</w:t>
       </w:r>
@@ -2604,12 +2604,12 @@
     <w:p>
       <w:pPr>
         <w:pStyle w:val="Heading1"/>
-        <w:spacing w:before="120" w:after="80"/>
+        <w:spacing w:before="100" w:after="60"/>
       </w:pPr>
       <w:r>
         <w:rPr>
           <w:color w:val="142850"/>
-          <w:sz w:val="24"/>
+          <w:sz w:val="22"/>
         </w:rPr>
         <w:t>4. Key Observations &amp; Answers to Assignment Questions</w:t>
       </w:r>
@@ -2617,19 +2617,19 @@
     <w:p>
       <w:pPr>
         <w:pStyle w:val="ListBullet"/>
-        <w:spacing w:after="50" w:line="276" w:lineRule="auto"/>
+        <w:spacing w:after="40" w:line="269" w:lineRule="auto"/>
       </w:pPr>
       <w:r>
         <w:rPr>
           <w:b/>
           <w:color w:val="142850"/>
-          <w:sz w:val="19"/>
+          <w:sz w:val="18"/>
         </w:rPr>
         <w:t xml:space="preserve">Part 1 (Gradient Check): </w:t>
       </w:r>
       <w:r>
         <w:rPr>
-          <w:sz w:val="18"/>
+          <w:sz w:val="17"/>
         </w:rPr>
         <w:t>The max difference between NumPy manual backprop and PyTorch autograd was 2.88e-08, which is around 1e-8. This confirms the manual forward and backward pass implementation is 100% mathematically correct.</w:t>
       </w:r>
@@ -2637,19 +2637,19 @@
     <w:p>
       <w:pPr>
         <w:pStyle w:val="ListBullet"/>
-        <w:spacing w:after="50" w:line="276" w:lineRule="auto"/>
+        <w:spacing w:after="40" w:line="269" w:lineRule="auto"/>
       </w:pPr>
       <w:r>
         <w:rPr>
           <w:b/>
           <w:color w:val="142850"/>
-          <w:sz w:val="19"/>
+          <w:sz w:val="18"/>
         </w:rPr>
         <w:t xml:space="preserve">Part 2 (Vanishing Gradients - Two Sentences): </w:t>
       </w:r>
       <w:r>
         <w:rPr>
-          <w:sz w:val="18"/>
+          <w:sz w:val="17"/>
         </w:rPr>
         <w:t>The first-layer mean gradient for Sigmoid at epoch 1 (0.000095) is almost an order of magnitude smaller than ReLU (0.000662), showing that Sigmoid squashes gradients early on. Because the derivative of Sigmoid cannot exceed 0.25, backpropagating through multiple layers repeatedly shrinks the error signals reaching the earliest weights.</w:t>
       </w:r>
@@ -2657,19 +2657,19 @@
     <w:p>
       <w:pPr>
         <w:pStyle w:val="ListBullet"/>
-        <w:spacing w:after="50" w:line="276" w:lineRule="auto"/>
+        <w:spacing w:after="40" w:line="269" w:lineRule="auto"/>
       </w:pPr>
       <w:r>
         <w:rPr>
           <w:b/>
           <w:color w:val="142850"/>
-          <w:sz w:val="19"/>
+          <w:sz w:val="18"/>
         </w:rPr>
         <w:t xml:space="preserve">Part 2 (Dead Units - Two Sentences): </w:t>
       </w:r>
       <w:r>
         <w:rPr>
-          <w:sz w:val="18"/>
+          <w:sz w:val="17"/>
         </w:rPr>
         <w:t>In the validation set, 9.90% of hidden units (19 out of 192) outputted zero for every single sample, showing that some neurons got pushed into the negative inactive zone where their gradient stays zero. However, since roughly 90% of the units remained active, the network learned effectively without suffering from a widespread dying ReLU breakdown.</w:t>
       </w:r>
@@ -2677,19 +2677,19 @@
     <w:p>
       <w:pPr>
         <w:pStyle w:val="ListBullet"/>
-        <w:spacing w:after="50" w:line="276" w:lineRule="auto"/>
+        <w:spacing w:after="40" w:line="269" w:lineRule="auto"/>
       </w:pPr>
       <w:r>
         <w:rPr>
           <w:b/>
           <w:color w:val="142850"/>
-          <w:sz w:val="19"/>
+          <w:sz w:val="18"/>
         </w:rPr>
         <w:t xml:space="preserve">Part 3 (Cross-Entropy vs MSE): </w:t>
       </w:r>
       <w:r>
         <w:rPr>
-          <w:sz w:val="18"/>
+          <w:sz w:val="17"/>
         </w:rPr>
         <w:t>With cross-entropy and softmax, the gradient is just (predicted - actual), so large errors get large gradients that quickly correct mistakes. With MSE, the gradient gets multiplied by the softmax derivative, which becomes close to zero when predictions are confident but wrong, causing training to stall.</w:t>
       </w:r>
@@ -2697,19 +2697,19 @@
     <w:p>
       <w:pPr>
         <w:pStyle w:val="ListBullet"/>
-        <w:spacing w:after="50" w:line="276" w:lineRule="auto"/>
+        <w:spacing w:after="40" w:line="269" w:lineRule="auto"/>
       </w:pPr>
       <w:r>
         <w:rPr>
           <w:b/>
           <w:color w:val="142850"/>
-          <w:sz w:val="19"/>
+          <w:sz w:val="18"/>
         </w:rPr>
         <w:t xml:space="preserve">Part 3 (Tabular Regression Results): </w:t>
       </w:r>
       <w:r>
         <w:rPr>
-          <w:sz w:val="18"/>
+          <w:sz w:val="17"/>
         </w:rPr>
         <w:t>Trained an 8 -&gt; 64 -&gt; 32 -&gt; 1 MLP on California Housing: Test MSE = 0.2862, RMSE = 0.5350, MAE = 0.3692.</w:t>
       </w:r>
@@ -2717,19 +2717,19 @@
     <w:p>
       <w:pPr>
         <w:pStyle w:val="ListBullet"/>
-        <w:spacing w:after="50" w:line="276" w:lineRule="auto"/>
+        <w:spacing w:after="40" w:line="269" w:lineRule="auto"/>
       </w:pPr>
       <w:r>
         <w:rPr>
           <w:b/>
           <w:color w:val="142850"/>
-          <w:sz w:val="19"/>
+          <w:sz w:val="18"/>
         </w:rPr>
         <w:t xml:space="preserve">Part 5 (Bias vs Variance Diagnosis): </w:t>
       </w:r>
       <w:r>
         <w:rPr>
-          <w:sz w:val="18"/>
+          <w:sz w:val="17"/>
         </w:rPr>
         <w:t>This model has very low bias and extreme high variance. The low bias is shown by the 99.45% training accuracy, while the high variance is shown by the large 16.71% generalization gap and validation loss rising after Epoch 7.</w:t>
       </w:r>
@@ -2737,26 +2737,26 @@
     <w:p>
       <w:pPr>
         <w:pStyle w:val="ListBullet"/>
-        <w:spacing w:after="50" w:line="276" w:lineRule="auto"/>
+        <w:spacing w:after="40" w:line="269" w:lineRule="auto"/>
       </w:pPr>
       <w:r>
         <w:rPr>
           <w:b/>
           <w:color w:val="142850"/>
-          <w:sz w:val="19"/>
+          <w:sz w:val="18"/>
         </w:rPr>
         <w:t xml:space="preserve">Part 7 (Baseline Comparison &amp; Analysis): </w:t>
       </w:r>
       <w:r>
         <w:rPr>
-          <w:sz w:val="18"/>
+          <w:sz w:val="17"/>
         </w:rPr>
         <w:t>The tuned model achieved 90.45% on the held-out test set, improving by +2.15 percentage points over the Part 2 baseline (88.30%). The combination of a wider layer (512 units), gentle dropout (0.2), and batch normalisation preserved representational power for difficult clothing classes (Shirts and Pullovers) while effectively controlling overfitting.</w:t>
       </w:r>
     </w:p>
     <w:sectPr>
       <w:pgSz w:w="12240" w:h="15840"/>
-      <w:pgMar w:top="1008" w:right="1080" w:bottom="1008" w:left="1080" w:header="720" w:footer="720" w:gutter="0"/>
+      <w:pgMar w:top="864" w:right="1008" w:bottom="864" w:left="1008" w:header="720" w:footer="720" w:gutter="0"/>
       <w:cols w:space="720"/>
       <w:docGrid w:linePitch="360"/>
     </w:sectPr>

</xml_diff>